<commit_message>
Upload final Strategic Thinking Capstone Project Proposal
</commit_message>
<xml_diff>
--- a/Strategic thinking.docx
+++ b/Strategic thinking.docx
@@ -2,6 +2,16 @@
 <file path=word/document.xml><?xml version="1.0" encoding="utf-8"?>
 <w:document xmlns:wpc="http://schemas.microsoft.com/office/word/2010/wordprocessingCanvas" xmlns:cx="http://schemas.microsoft.com/office/drawing/2014/chartex" xmlns:cx1="http://schemas.microsoft.com/office/drawing/2015/9/8/chartex" xmlns:cx2="http://schemas.microsoft.com/office/drawing/2015/10/21/chartex" xmlns:cx3="http://schemas.microsoft.com/office/drawing/2016/5/9/chartex" xmlns:cx4="http://schemas.microsoft.com/office/drawing/2016/5/10/chartex" xmlns:cx5="http://schemas.microsoft.com/office/drawing/2016/5/11/chartex" xmlns:cx6="http://schemas.microsoft.com/office/drawing/2016/5/12/chartex" xmlns:cx7="http://schemas.microsoft.com/office/drawing/2016/5/13/chartex" xmlns:cx8="http://schemas.microsoft.com/office/drawing/2016/5/14/chartex" xmlns:mc="http://schemas.openxmlformats.org/markup-compatibility/2006" xmlns:aink="http://schemas.microsoft.com/office/drawing/2016/ink" xmlns:am3d="http://schemas.microsoft.com/office/drawing/2017/model3d" xmlns:o="urn:schemas-microsoft-com:office:office" xmlns:oel="http://schemas.microsoft.com/office/2019/extlst" xmlns:r="http://schemas.openxmlformats.org/officeDocument/2006/relationships" xmlns:m="http://schemas.openxmlformats.org/officeDocument/2006/math" xmlns:v="urn:schemas-microsoft-com:vml" xmlns:wp14="http://schemas.microsoft.com/office/word/2010/wordprocessingDrawing" xmlns:wp="http://schemas.openxmlformats.org/drawingml/2006/wordprocessingDrawing" xmlns:w10="urn:schemas-microsoft-com:office:word" xmlns:w="http://schemas.openxmlformats.org/wordprocessingml/2006/main" xmlns:w14="http://schemas.microsoft.com/office/word/2010/wordml" xmlns:w15="http://schemas.microsoft.com/office/word/2012/wordml" xmlns:w16cex="http://schemas.microsoft.com/office/word/2018/wordml/cex" xmlns:w16cid="http://schemas.microsoft.com/office/word/2016/wordml/cid" xmlns:w16="http://schemas.microsoft.com/office/word/2018/wordml" xmlns:w16du="http://schemas.microsoft.com/office/word/2023/wordml/word16du" xmlns:w16sdtdh="http://schemas.microsoft.com/office/word/2020/wordml/sdtdatahash" xmlns:w16sdtfl="http://schemas.microsoft.com/office/word/2024/wordml/sdtformatlock" xmlns:w16se="http://schemas.microsoft.com/office/word/2015/wordml/symex" xmlns:wpg="http://schemas.microsoft.com/office/word/2010/wordprocessingGroup" xmlns:wpi="http://schemas.microsoft.com/office/word/2010/wordprocessingInk" xmlns:wne="http://schemas.microsoft.com/office/word/2006/wordml" xmlns:wps="http://schemas.microsoft.com/office/word/2010/wordprocessingShape" mc:Ignorable="w14 w15 w16se w16cid w16 w16cex w16sdtdh w16sdtfl w16du wp14">
   <w:body>
+    <w:p>
+      <w:pPr>
+        <w:rPr>
+          <w:b/>
+          <w:color w:val="156082"/>
+          <w:sz w:val="36"/>
+          <w:szCs w:val="36"/>
+        </w:rPr>
+      </w:pPr>
+    </w:p>
     <w:p>
       <w:r>
         <w:rPr>
@@ -242,17 +252,6 @@
           </wp:anchor>
         </w:drawing>
       </w:r>
-    </w:p>
-    <w:p>
-      <w:pPr>
-        <w:spacing w:line="600" w:lineRule="auto"/>
-        <w:rPr>
-          <w:b/>
-          <w:color w:val="156082"/>
-          <w:sz w:val="36"/>
-          <w:szCs w:val="36"/>
-        </w:rPr>
-      </w:pPr>
       <w:r>
         <w:rPr>
           <w:b/>
@@ -622,19 +621,6 @@
           </w:p>
           <w:p>
             <w:pPr>
-              <w:spacing w:line="360" w:lineRule="auto"/>
-              <w:rPr>
-                <w:b/>
-                <w:bCs/>
-                <w:i/>
-                <w:color w:val="156082"/>
-                <w:sz w:val="32"/>
-                <w:szCs w:val="32"/>
-              </w:rPr>
-            </w:pPr>
-          </w:p>
-          <w:p>
-            <w:pPr>
               <w:spacing w:line="480" w:lineRule="auto"/>
               <w:rPr>
                 <w:i/>
@@ -715,6 +701,7 @@
                 <w:szCs w:val="32"/>
               </w:rPr>
             </w:pPr>
+            <w:proofErr w:type="spellStart"/>
             <w:r>
               <w:rPr>
                 <w:b/>
@@ -724,12 +711,10 @@
                 <w:sz w:val="32"/>
                 <w:szCs w:val="32"/>
               </w:rPr>
-              <w:t>Taufique Ahmed</w:t>
-            </w:r>
-          </w:p>
-          <w:p>
-            <w:pPr>
-              <w:spacing w:line="480" w:lineRule="auto"/>
+              <w:t>Taufique</w:t>
+            </w:r>
+            <w:proofErr w:type="spellEnd"/>
+            <w:r>
               <w:rPr>
                 <w:b/>
                 <w:bCs/>
@@ -738,7 +723,8 @@
                 <w:sz w:val="32"/>
                 <w:szCs w:val="32"/>
               </w:rPr>
-            </w:pPr>
+              <w:t xml:space="preserve"> Ahmed</w:t>
+            </w:r>
           </w:p>
           <w:p>
             <w:pPr>
@@ -752,6 +738,64 @@
                 <w:szCs w:val="32"/>
               </w:rPr>
             </w:pPr>
+          </w:p>
+          <w:p>
+            <w:pPr>
+              <w:spacing w:line="480" w:lineRule="auto"/>
+              <w:rPr>
+                <w:i/>
+                <w:color w:val="156082"/>
+                <w:sz w:val="32"/>
+                <w:szCs w:val="32"/>
+              </w:rPr>
+            </w:pPr>
+            <w:r>
+              <w:rPr>
+                <w:i/>
+                <w:color w:val="156082"/>
+                <w:sz w:val="32"/>
+                <w:szCs w:val="32"/>
+              </w:rPr>
+              <w:t>GitH</w:t>
+            </w:r>
+            <w:r>
+              <w:rPr>
+                <w:i/>
+                <w:color w:val="156082"/>
+                <w:sz w:val="32"/>
+                <w:szCs w:val="32"/>
+              </w:rPr>
+              <w:t>u</w:t>
+            </w:r>
+            <w:r>
+              <w:rPr>
+                <w:i/>
+                <w:color w:val="156082"/>
+                <w:sz w:val="32"/>
+                <w:szCs w:val="32"/>
+              </w:rPr>
+              <w:t xml:space="preserve">b </w:t>
+            </w:r>
+          </w:p>
+          <w:p>
+            <w:pPr>
+              <w:spacing w:line="480" w:lineRule="auto"/>
+              <w:rPr>
+                <w:i/>
+                <w:color w:val="156082"/>
+                <w:sz w:val="28"/>
+                <w:szCs w:val="28"/>
+              </w:rPr>
+            </w:pPr>
+            <w:r>
+              <w:rPr>
+                <w:i/>
+                <w:color w:val="156082"/>
+                <w:sz w:val="28"/>
+                <w:szCs w:val="28"/>
+              </w:rPr>
+              <w:t>https://github.com/sba26107-ai/Capstone-project---2026</w:t>
+            </w:r>
           </w:p>
           <w:p>
             <w:pPr>
@@ -932,7 +976,25 @@
                 <w:sz w:val="32"/>
                 <w:szCs w:val="32"/>
               </w:rPr>
-              <w:t>17/10/2026</w:t>
+              <w:t>1</w:t>
+            </w:r>
+            <w:r>
+              <w:rPr>
+                <w:i/>
+                <w:color w:val="156082"/>
+                <w:sz w:val="32"/>
+                <w:szCs w:val="32"/>
+              </w:rPr>
+              <w:t>5</w:t>
+            </w:r>
+            <w:r>
+              <w:rPr>
+                <w:i/>
+                <w:color w:val="156082"/>
+                <w:sz w:val="32"/>
+                <w:szCs w:val="32"/>
+              </w:rPr>
+              <w:t>/10/2026</w:t>
             </w:r>
           </w:p>
           <w:p>
@@ -1010,7 +1072,15 @@
           <w:sz w:val="28"/>
           <w:szCs w:val="28"/>
         </w:rPr>
-        <w:t xml:space="preserve"> ChatGPT</w:t>
+        <w:t xml:space="preserve"> </w:t>
+      </w:r>
+      <w:r>
+        <w:rPr>
+          <w:bCs/>
+          <w:sz w:val="28"/>
+          <w:szCs w:val="28"/>
+        </w:rPr>
+        <w:t>ChatGPT</w:t>
       </w:r>
       <w:r>
         <w:rPr>
@@ -1229,7 +1299,6 @@
         </w:sectPr>
       </w:pPr>
     </w:p>
-    <w:p/>
     <w:p>
       <w:pPr>
         <w:keepNext/>
@@ -1249,15 +1318,6 @@
           <w:szCs w:val="32"/>
         </w:rPr>
       </w:pPr>
-      <w:r>
-        <w:rPr>
-          <w:rFonts w:ascii="Play" w:eastAsia="Play" w:hAnsi="Play" w:cs="Play"/>
-          <w:color w:val="0F4761"/>
-          <w:sz w:val="32"/>
-          <w:szCs w:val="32"/>
-        </w:rPr>
-        <w:t>Contents</w:t>
-      </w:r>
     </w:p>
     <w:sdt>
       <w:sdtPr>
@@ -1316,7 +1376,7 @@
           <w:r>
             <w:fldChar w:fldCharType="separate"/>
           </w:r>
-          <w:hyperlink w:anchor="_Toc242732583" w:history="1">
+          <w:hyperlink w:anchor="_Toc242948920" w:history="1">
             <w:r>
               <w:rPr>
                 <w:rStyle w:val="Hyperlink"/>
@@ -1358,7 +1418,7 @@
                 <w:noProof/>
                 <w:webHidden/>
               </w:rPr>
-              <w:instrText xml:space="preserve"> PAGEREF _Toc242732583 \h </w:instrText>
+              <w:instrText xml:space="preserve"> PAGEREF _Toc242948920 \h </w:instrText>
             </w:r>
             <w:r>
               <w:rPr>
@@ -1402,7 +1462,7 @@
               <w:lang w:eastAsia="en-IE"/>
             </w:rPr>
           </w:pPr>
-          <w:hyperlink w:anchor="_Toc242732584" w:history="1">
+          <w:hyperlink w:anchor="_Toc242948921" w:history="1">
             <w:r>
               <w:rPr>
                 <w:rStyle w:val="Hyperlink"/>
@@ -1444,7 +1504,7 @@
                 <w:noProof/>
                 <w:webHidden/>
               </w:rPr>
-              <w:instrText xml:space="preserve"> PAGEREF _Toc242732584 \h </w:instrText>
+              <w:instrText xml:space="preserve"> PAGEREF _Toc242948921 \h </w:instrText>
             </w:r>
             <w:r>
               <w:rPr>
@@ -1465,873 +1525,6 @@
                 <w:webHidden/>
               </w:rPr>
               <w:t>5</w:t>
-            </w:r>
-            <w:r>
-              <w:rPr>
-                <w:noProof/>
-                <w:webHidden/>
-              </w:rPr>
-              <w:fldChar w:fldCharType="end"/>
-            </w:r>
-          </w:hyperlink>
-        </w:p>
-        <w:p>
-          <w:pPr>
-            <w:pStyle w:val="TOC1"/>
-            <w:tabs>
-              <w:tab w:val="right" w:leader="dot" w:pos="9016"/>
-            </w:tabs>
-            <w:rPr>
-              <w:rFonts w:eastAsiaTheme="minorEastAsia"/>
-              <w:noProof/>
-              <w:lang w:eastAsia="en-IE"/>
-            </w:rPr>
-          </w:pPr>
-          <w:hyperlink w:anchor="_Toc242732585" w:history="1">
-            <w:r>
-              <w:rPr>
-                <w:rStyle w:val="Hyperlink"/>
-                <w:noProof/>
-              </w:rPr>
-              <w:t xml:space="preserve">3. </w:t>
-            </w:r>
-            <w:r>
-              <w:rPr>
-                <w:rStyle w:val="Hyperlink"/>
-                <w:b/>
-                <w:bCs/>
-                <w:noProof/>
-              </w:rPr>
-              <w:t>Aim and Objectives</w:t>
-            </w:r>
-            <w:r>
-              <w:rPr>
-                <w:noProof/>
-                <w:webHidden/>
-              </w:rPr>
-              <w:tab/>
-            </w:r>
-            <w:r>
-              <w:rPr>
-                <w:noProof/>
-                <w:webHidden/>
-              </w:rPr>
-              <w:fldChar w:fldCharType="begin"/>
-            </w:r>
-            <w:r>
-              <w:rPr>
-                <w:noProof/>
-                <w:webHidden/>
-              </w:rPr>
-              <w:instrText xml:space="preserve"> PAGEREF _Toc242732585 \h </w:instrText>
-            </w:r>
-            <w:r>
-              <w:rPr>
-                <w:noProof/>
-                <w:webHidden/>
-              </w:rPr>
-            </w:r>
-            <w:r>
-              <w:rPr>
-                <w:noProof/>
-                <w:webHidden/>
-              </w:rPr>
-              <w:fldChar w:fldCharType="separate"/>
-            </w:r>
-            <w:r>
-              <w:rPr>
-                <w:noProof/>
-                <w:webHidden/>
-              </w:rPr>
-              <w:t>6</w:t>
-            </w:r>
-            <w:r>
-              <w:rPr>
-                <w:noProof/>
-                <w:webHidden/>
-              </w:rPr>
-              <w:fldChar w:fldCharType="end"/>
-            </w:r>
-          </w:hyperlink>
-        </w:p>
-        <w:p>
-          <w:pPr>
-            <w:pStyle w:val="TOC2"/>
-            <w:tabs>
-              <w:tab w:val="right" w:leader="dot" w:pos="9016"/>
-            </w:tabs>
-            <w:rPr>
-              <w:rFonts w:eastAsiaTheme="minorEastAsia"/>
-              <w:noProof/>
-              <w:lang w:eastAsia="en-IE"/>
-            </w:rPr>
-          </w:pPr>
-          <w:hyperlink w:anchor="_Toc242732586" w:history="1">
-            <w:r>
-              <w:rPr>
-                <w:rStyle w:val="Hyperlink"/>
-                <w:noProof/>
-              </w:rPr>
-              <w:t>3.1 Aim</w:t>
-            </w:r>
-            <w:r>
-              <w:rPr>
-                <w:noProof/>
-                <w:webHidden/>
-              </w:rPr>
-              <w:tab/>
-            </w:r>
-            <w:r>
-              <w:rPr>
-                <w:noProof/>
-                <w:webHidden/>
-              </w:rPr>
-              <w:fldChar w:fldCharType="begin"/>
-            </w:r>
-            <w:r>
-              <w:rPr>
-                <w:noProof/>
-                <w:webHidden/>
-              </w:rPr>
-              <w:instrText xml:space="preserve"> PAGEREF _Toc242732586 \h </w:instrText>
-            </w:r>
-            <w:r>
-              <w:rPr>
-                <w:noProof/>
-                <w:webHidden/>
-              </w:rPr>
-            </w:r>
-            <w:r>
-              <w:rPr>
-                <w:noProof/>
-                <w:webHidden/>
-              </w:rPr>
-              <w:fldChar w:fldCharType="separate"/>
-            </w:r>
-            <w:r>
-              <w:rPr>
-                <w:noProof/>
-                <w:webHidden/>
-              </w:rPr>
-              <w:t>6</w:t>
-            </w:r>
-            <w:r>
-              <w:rPr>
-                <w:noProof/>
-                <w:webHidden/>
-              </w:rPr>
-              <w:fldChar w:fldCharType="end"/>
-            </w:r>
-          </w:hyperlink>
-        </w:p>
-        <w:p>
-          <w:pPr>
-            <w:pStyle w:val="TOC2"/>
-            <w:tabs>
-              <w:tab w:val="right" w:leader="dot" w:pos="9016"/>
-            </w:tabs>
-            <w:rPr>
-              <w:rFonts w:eastAsiaTheme="minorEastAsia"/>
-              <w:noProof/>
-              <w:lang w:eastAsia="en-IE"/>
-            </w:rPr>
-          </w:pPr>
-          <w:hyperlink w:anchor="_Toc242732587" w:history="1">
-            <w:r>
-              <w:rPr>
-                <w:rStyle w:val="Hyperlink"/>
-                <w:noProof/>
-              </w:rPr>
-              <w:t>3.2 Objectives</w:t>
-            </w:r>
-            <w:r>
-              <w:rPr>
-                <w:noProof/>
-                <w:webHidden/>
-              </w:rPr>
-              <w:tab/>
-            </w:r>
-            <w:r>
-              <w:rPr>
-                <w:noProof/>
-                <w:webHidden/>
-              </w:rPr>
-              <w:fldChar w:fldCharType="begin"/>
-            </w:r>
-            <w:r>
-              <w:rPr>
-                <w:noProof/>
-                <w:webHidden/>
-              </w:rPr>
-              <w:instrText xml:space="preserve"> PAGEREF _Toc242732587 \h </w:instrText>
-            </w:r>
-            <w:r>
-              <w:rPr>
-                <w:noProof/>
-                <w:webHidden/>
-              </w:rPr>
-            </w:r>
-            <w:r>
-              <w:rPr>
-                <w:noProof/>
-                <w:webHidden/>
-              </w:rPr>
-              <w:fldChar w:fldCharType="separate"/>
-            </w:r>
-            <w:r>
-              <w:rPr>
-                <w:noProof/>
-                <w:webHidden/>
-              </w:rPr>
-              <w:t>6</w:t>
-            </w:r>
-            <w:r>
-              <w:rPr>
-                <w:noProof/>
-                <w:webHidden/>
-              </w:rPr>
-              <w:fldChar w:fldCharType="end"/>
-            </w:r>
-          </w:hyperlink>
-        </w:p>
-        <w:p>
-          <w:pPr>
-            <w:pStyle w:val="TOC2"/>
-            <w:tabs>
-              <w:tab w:val="right" w:leader="dot" w:pos="9016"/>
-            </w:tabs>
-            <w:rPr>
-              <w:rFonts w:eastAsiaTheme="minorEastAsia"/>
-              <w:noProof/>
-              <w:lang w:eastAsia="en-IE"/>
-            </w:rPr>
-          </w:pPr>
-          <w:hyperlink w:anchor="_Toc242732588" w:history="1">
-            <w:r>
-              <w:rPr>
-                <w:rStyle w:val="Hyperlink"/>
-                <w:noProof/>
-              </w:rPr>
-              <w:t>3.3 Business Hypothesis</w:t>
-            </w:r>
-            <w:r>
-              <w:rPr>
-                <w:noProof/>
-                <w:webHidden/>
-              </w:rPr>
-              <w:tab/>
-            </w:r>
-            <w:r>
-              <w:rPr>
-                <w:noProof/>
-                <w:webHidden/>
-              </w:rPr>
-              <w:fldChar w:fldCharType="begin"/>
-            </w:r>
-            <w:r>
-              <w:rPr>
-                <w:noProof/>
-                <w:webHidden/>
-              </w:rPr>
-              <w:instrText xml:space="preserve"> PAGEREF _Toc242732588 \h </w:instrText>
-            </w:r>
-            <w:r>
-              <w:rPr>
-                <w:noProof/>
-                <w:webHidden/>
-              </w:rPr>
-            </w:r>
-            <w:r>
-              <w:rPr>
-                <w:noProof/>
-                <w:webHidden/>
-              </w:rPr>
-              <w:fldChar w:fldCharType="separate"/>
-            </w:r>
-            <w:r>
-              <w:rPr>
-                <w:noProof/>
-                <w:webHidden/>
-              </w:rPr>
-              <w:t>6</w:t>
-            </w:r>
-            <w:r>
-              <w:rPr>
-                <w:noProof/>
-                <w:webHidden/>
-              </w:rPr>
-              <w:fldChar w:fldCharType="end"/>
-            </w:r>
-          </w:hyperlink>
-        </w:p>
-        <w:p>
-          <w:pPr>
-            <w:pStyle w:val="TOC1"/>
-            <w:tabs>
-              <w:tab w:val="right" w:leader="dot" w:pos="9016"/>
-            </w:tabs>
-            <w:rPr>
-              <w:rFonts w:eastAsiaTheme="minorEastAsia"/>
-              <w:noProof/>
-              <w:lang w:eastAsia="en-IE"/>
-            </w:rPr>
-          </w:pPr>
-          <w:hyperlink w:anchor="_Toc242732589" w:history="1">
-            <w:r>
-              <w:rPr>
-                <w:rStyle w:val="Hyperlink"/>
-                <w:noProof/>
-              </w:rPr>
-              <w:t>4. Scope</w:t>
-            </w:r>
-            <w:r>
-              <w:rPr>
-                <w:noProof/>
-                <w:webHidden/>
-              </w:rPr>
-              <w:tab/>
-            </w:r>
-            <w:r>
-              <w:rPr>
-                <w:noProof/>
-                <w:webHidden/>
-              </w:rPr>
-              <w:fldChar w:fldCharType="begin"/>
-            </w:r>
-            <w:r>
-              <w:rPr>
-                <w:noProof/>
-                <w:webHidden/>
-              </w:rPr>
-              <w:instrText xml:space="preserve"> PAGEREF _Toc242732589 \h </w:instrText>
-            </w:r>
-            <w:r>
-              <w:rPr>
-                <w:noProof/>
-                <w:webHidden/>
-              </w:rPr>
-            </w:r>
-            <w:r>
-              <w:rPr>
-                <w:noProof/>
-                <w:webHidden/>
-              </w:rPr>
-              <w:fldChar w:fldCharType="separate"/>
-            </w:r>
-            <w:r>
-              <w:rPr>
-                <w:noProof/>
-                <w:webHidden/>
-              </w:rPr>
-              <w:t>6</w:t>
-            </w:r>
-            <w:r>
-              <w:rPr>
-                <w:noProof/>
-                <w:webHidden/>
-              </w:rPr>
-              <w:fldChar w:fldCharType="end"/>
-            </w:r>
-          </w:hyperlink>
-        </w:p>
-        <w:p>
-          <w:pPr>
-            <w:pStyle w:val="TOC1"/>
-            <w:tabs>
-              <w:tab w:val="right" w:leader="dot" w:pos="9016"/>
-            </w:tabs>
-            <w:rPr>
-              <w:rFonts w:eastAsiaTheme="minorEastAsia"/>
-              <w:noProof/>
-              <w:lang w:eastAsia="en-IE"/>
-            </w:rPr>
-          </w:pPr>
-          <w:hyperlink w:anchor="_Toc242732590" w:history="1">
-            <w:r>
-              <w:rPr>
-                <w:rStyle w:val="Hyperlink"/>
-                <w:b/>
-                <w:bCs/>
-                <w:noProof/>
-              </w:rPr>
-              <w:t>5.Methodology</w:t>
-            </w:r>
-            <w:r>
-              <w:rPr>
-                <w:noProof/>
-                <w:webHidden/>
-              </w:rPr>
-              <w:tab/>
-            </w:r>
-            <w:r>
-              <w:rPr>
-                <w:noProof/>
-                <w:webHidden/>
-              </w:rPr>
-              <w:fldChar w:fldCharType="begin"/>
-            </w:r>
-            <w:r>
-              <w:rPr>
-                <w:noProof/>
-                <w:webHidden/>
-              </w:rPr>
-              <w:instrText xml:space="preserve"> PAGEREF _Toc242732590 \h </w:instrText>
-            </w:r>
-            <w:r>
-              <w:rPr>
-                <w:noProof/>
-                <w:webHidden/>
-              </w:rPr>
-            </w:r>
-            <w:r>
-              <w:rPr>
-                <w:noProof/>
-                <w:webHidden/>
-              </w:rPr>
-              <w:fldChar w:fldCharType="separate"/>
-            </w:r>
-            <w:r>
-              <w:rPr>
-                <w:noProof/>
-                <w:webHidden/>
-              </w:rPr>
-              <w:t>7</w:t>
-            </w:r>
-            <w:r>
-              <w:rPr>
-                <w:noProof/>
-                <w:webHidden/>
-              </w:rPr>
-              <w:fldChar w:fldCharType="end"/>
-            </w:r>
-          </w:hyperlink>
-        </w:p>
-        <w:p>
-          <w:pPr>
-            <w:pStyle w:val="TOC2"/>
-            <w:tabs>
-              <w:tab w:val="right" w:leader="dot" w:pos="9016"/>
-            </w:tabs>
-            <w:rPr>
-              <w:rFonts w:eastAsiaTheme="minorEastAsia"/>
-              <w:noProof/>
-              <w:lang w:eastAsia="en-IE"/>
-            </w:rPr>
-          </w:pPr>
-          <w:hyperlink w:anchor="_Toc242732591" w:history="1">
-            <w:r>
-              <w:rPr>
-                <w:rStyle w:val="Hyperlink"/>
-                <w:noProof/>
-              </w:rPr>
-              <w:t>5.1 Data Preparation and Exploratory Analysis</w:t>
-            </w:r>
-            <w:r>
-              <w:rPr>
-                <w:noProof/>
-                <w:webHidden/>
-              </w:rPr>
-              <w:tab/>
-            </w:r>
-            <w:r>
-              <w:rPr>
-                <w:noProof/>
-                <w:webHidden/>
-              </w:rPr>
-              <w:fldChar w:fldCharType="begin"/>
-            </w:r>
-            <w:r>
-              <w:rPr>
-                <w:noProof/>
-                <w:webHidden/>
-              </w:rPr>
-              <w:instrText xml:space="preserve"> PAGEREF _Toc242732591 \h </w:instrText>
-            </w:r>
-            <w:r>
-              <w:rPr>
-                <w:noProof/>
-                <w:webHidden/>
-              </w:rPr>
-            </w:r>
-            <w:r>
-              <w:rPr>
-                <w:noProof/>
-                <w:webHidden/>
-              </w:rPr>
-              <w:fldChar w:fldCharType="separate"/>
-            </w:r>
-            <w:r>
-              <w:rPr>
-                <w:noProof/>
-                <w:webHidden/>
-              </w:rPr>
-              <w:t>7</w:t>
-            </w:r>
-            <w:r>
-              <w:rPr>
-                <w:noProof/>
-                <w:webHidden/>
-              </w:rPr>
-              <w:fldChar w:fldCharType="end"/>
-            </w:r>
-          </w:hyperlink>
-        </w:p>
-        <w:p>
-          <w:pPr>
-            <w:pStyle w:val="TOC2"/>
-            <w:tabs>
-              <w:tab w:val="right" w:leader="dot" w:pos="9016"/>
-            </w:tabs>
-            <w:rPr>
-              <w:rFonts w:eastAsiaTheme="minorEastAsia"/>
-              <w:noProof/>
-              <w:lang w:eastAsia="en-IE"/>
-            </w:rPr>
-          </w:pPr>
-          <w:hyperlink w:anchor="_Toc242732592" w:history="1">
-            <w:r>
-              <w:rPr>
-                <w:rStyle w:val="Hyperlink"/>
-                <w:noProof/>
-              </w:rPr>
-              <w:t>5.2 Predictive Modelling</w:t>
-            </w:r>
-            <w:r>
-              <w:rPr>
-                <w:noProof/>
-                <w:webHidden/>
-              </w:rPr>
-              <w:tab/>
-            </w:r>
-            <w:r>
-              <w:rPr>
-                <w:noProof/>
-                <w:webHidden/>
-              </w:rPr>
-              <w:fldChar w:fldCharType="begin"/>
-            </w:r>
-            <w:r>
-              <w:rPr>
-                <w:noProof/>
-                <w:webHidden/>
-              </w:rPr>
-              <w:instrText xml:space="preserve"> PAGEREF _Toc242732592 \h </w:instrText>
-            </w:r>
-            <w:r>
-              <w:rPr>
-                <w:noProof/>
-                <w:webHidden/>
-              </w:rPr>
-            </w:r>
-            <w:r>
-              <w:rPr>
-                <w:noProof/>
-                <w:webHidden/>
-              </w:rPr>
-              <w:fldChar w:fldCharType="separate"/>
-            </w:r>
-            <w:r>
-              <w:rPr>
-                <w:noProof/>
-                <w:webHidden/>
-              </w:rPr>
-              <w:t>7</w:t>
-            </w:r>
-            <w:r>
-              <w:rPr>
-                <w:noProof/>
-                <w:webHidden/>
-              </w:rPr>
-              <w:fldChar w:fldCharType="end"/>
-            </w:r>
-          </w:hyperlink>
-        </w:p>
-        <w:p>
-          <w:pPr>
-            <w:pStyle w:val="TOC2"/>
-            <w:tabs>
-              <w:tab w:val="right" w:leader="dot" w:pos="9016"/>
-            </w:tabs>
-            <w:rPr>
-              <w:rFonts w:eastAsiaTheme="minorEastAsia"/>
-              <w:noProof/>
-              <w:lang w:eastAsia="en-IE"/>
-            </w:rPr>
-          </w:pPr>
-          <w:hyperlink w:anchor="_Toc242732593" w:history="1">
-            <w:r>
-              <w:rPr>
-                <w:rStyle w:val="Hyperlink"/>
-                <w:noProof/>
-              </w:rPr>
-              <w:t>5.3 Connection Risk Assessment</w:t>
-            </w:r>
-            <w:r>
-              <w:rPr>
-                <w:noProof/>
-                <w:webHidden/>
-              </w:rPr>
-              <w:tab/>
-            </w:r>
-            <w:r>
-              <w:rPr>
-                <w:noProof/>
-                <w:webHidden/>
-              </w:rPr>
-              <w:fldChar w:fldCharType="begin"/>
-            </w:r>
-            <w:r>
-              <w:rPr>
-                <w:noProof/>
-                <w:webHidden/>
-              </w:rPr>
-              <w:instrText xml:space="preserve"> PAGEREF _Toc242732593 \h </w:instrText>
-            </w:r>
-            <w:r>
-              <w:rPr>
-                <w:noProof/>
-                <w:webHidden/>
-              </w:rPr>
-            </w:r>
-            <w:r>
-              <w:rPr>
-                <w:noProof/>
-                <w:webHidden/>
-              </w:rPr>
-              <w:fldChar w:fldCharType="separate"/>
-            </w:r>
-            <w:r>
-              <w:rPr>
-                <w:noProof/>
-                <w:webHidden/>
-              </w:rPr>
-              <w:t>7</w:t>
-            </w:r>
-            <w:r>
-              <w:rPr>
-                <w:noProof/>
-                <w:webHidden/>
-              </w:rPr>
-              <w:fldChar w:fldCharType="end"/>
-            </w:r>
-          </w:hyperlink>
-        </w:p>
-        <w:p>
-          <w:pPr>
-            <w:pStyle w:val="TOC2"/>
-            <w:tabs>
-              <w:tab w:val="right" w:leader="dot" w:pos="9016"/>
-            </w:tabs>
-            <w:rPr>
-              <w:rFonts w:eastAsiaTheme="minorEastAsia"/>
-              <w:noProof/>
-              <w:lang w:eastAsia="en-IE"/>
-            </w:rPr>
-          </w:pPr>
-          <w:hyperlink w:anchor="_Toc242732594" w:history="1">
-            <w:r>
-              <w:rPr>
-                <w:rStyle w:val="Hyperlink"/>
-                <w:noProof/>
-              </w:rPr>
-              <w:t>5.4 Technologies and Tools</w:t>
-            </w:r>
-            <w:r>
-              <w:rPr>
-                <w:noProof/>
-                <w:webHidden/>
-              </w:rPr>
-              <w:tab/>
-            </w:r>
-            <w:r>
-              <w:rPr>
-                <w:noProof/>
-                <w:webHidden/>
-              </w:rPr>
-              <w:fldChar w:fldCharType="begin"/>
-            </w:r>
-            <w:r>
-              <w:rPr>
-                <w:noProof/>
-                <w:webHidden/>
-              </w:rPr>
-              <w:instrText xml:space="preserve"> PAGEREF _Toc242732594 \h </w:instrText>
-            </w:r>
-            <w:r>
-              <w:rPr>
-                <w:noProof/>
-                <w:webHidden/>
-              </w:rPr>
-            </w:r>
-            <w:r>
-              <w:rPr>
-                <w:noProof/>
-                <w:webHidden/>
-              </w:rPr>
-              <w:fldChar w:fldCharType="separate"/>
-            </w:r>
-            <w:r>
-              <w:rPr>
-                <w:noProof/>
-                <w:webHidden/>
-              </w:rPr>
-              <w:t>8</w:t>
-            </w:r>
-            <w:r>
-              <w:rPr>
-                <w:noProof/>
-                <w:webHidden/>
-              </w:rPr>
-              <w:fldChar w:fldCharType="end"/>
-            </w:r>
-          </w:hyperlink>
-        </w:p>
-        <w:p>
-          <w:pPr>
-            <w:pStyle w:val="TOC1"/>
-            <w:tabs>
-              <w:tab w:val="right" w:leader="dot" w:pos="9016"/>
-            </w:tabs>
-            <w:rPr>
-              <w:rFonts w:eastAsiaTheme="minorEastAsia"/>
-              <w:noProof/>
-              <w:lang w:eastAsia="en-IE"/>
-            </w:rPr>
-          </w:pPr>
-          <w:hyperlink w:anchor="_Toc242732595" w:history="1">
-            <w:r>
-              <w:rPr>
-                <w:rStyle w:val="Hyperlink"/>
-                <w:noProof/>
-              </w:rPr>
-              <w:t>6.</w:t>
-            </w:r>
-            <w:r>
-              <w:rPr>
-                <w:rStyle w:val="Hyperlink"/>
-                <w:b/>
-                <w:bCs/>
-                <w:noProof/>
-              </w:rPr>
-              <w:t xml:space="preserve"> </w:t>
-            </w:r>
-            <w:r>
-              <w:rPr>
-                <w:rStyle w:val="Hyperlink"/>
-                <w:noProof/>
-              </w:rPr>
-              <w:t>High-Level Architecture</w:t>
-            </w:r>
-            <w:r>
-              <w:rPr>
-                <w:noProof/>
-                <w:webHidden/>
-              </w:rPr>
-              <w:tab/>
-            </w:r>
-            <w:r>
-              <w:rPr>
-                <w:noProof/>
-                <w:webHidden/>
-              </w:rPr>
-              <w:fldChar w:fldCharType="begin"/>
-            </w:r>
-            <w:r>
-              <w:rPr>
-                <w:noProof/>
-                <w:webHidden/>
-              </w:rPr>
-              <w:instrText xml:space="preserve"> PAGEREF _Toc242732595 \h </w:instrText>
-            </w:r>
-            <w:r>
-              <w:rPr>
-                <w:noProof/>
-                <w:webHidden/>
-              </w:rPr>
-            </w:r>
-            <w:r>
-              <w:rPr>
-                <w:noProof/>
-                <w:webHidden/>
-              </w:rPr>
-              <w:fldChar w:fldCharType="separate"/>
-            </w:r>
-            <w:r>
-              <w:rPr>
-                <w:noProof/>
-                <w:webHidden/>
-              </w:rPr>
-              <w:t>8</w:t>
-            </w:r>
-            <w:r>
-              <w:rPr>
-                <w:noProof/>
-                <w:webHidden/>
-              </w:rPr>
-              <w:fldChar w:fldCharType="end"/>
-            </w:r>
-          </w:hyperlink>
-        </w:p>
-        <w:p>
-          <w:pPr>
-            <w:pStyle w:val="TOC1"/>
-            <w:tabs>
-              <w:tab w:val="right" w:leader="dot" w:pos="9016"/>
-            </w:tabs>
-            <w:rPr>
-              <w:rFonts w:eastAsiaTheme="minorEastAsia"/>
-              <w:noProof/>
-              <w:lang w:eastAsia="en-IE"/>
-            </w:rPr>
-          </w:pPr>
-          <w:hyperlink w:anchor="_Toc242732596" w:history="1">
-            <w:r>
-              <w:rPr>
-                <w:rStyle w:val="Hyperlink"/>
-                <w:noProof/>
-              </w:rPr>
-              <w:t>7. Data Sources</w:t>
-            </w:r>
-            <w:r>
-              <w:rPr>
-                <w:noProof/>
-                <w:webHidden/>
-              </w:rPr>
-              <w:tab/>
-            </w:r>
-            <w:r>
-              <w:rPr>
-                <w:noProof/>
-                <w:webHidden/>
-              </w:rPr>
-              <w:fldChar w:fldCharType="begin"/>
-            </w:r>
-            <w:r>
-              <w:rPr>
-                <w:noProof/>
-                <w:webHidden/>
-              </w:rPr>
-              <w:instrText xml:space="preserve"> PAGEREF _Toc242732596 \h </w:instrText>
-            </w:r>
-            <w:r>
-              <w:rPr>
-                <w:noProof/>
-                <w:webHidden/>
-              </w:rPr>
-            </w:r>
-            <w:r>
-              <w:rPr>
-                <w:noProof/>
-                <w:webHidden/>
-              </w:rPr>
-              <w:fldChar w:fldCharType="separate"/>
-            </w:r>
-            <w:r>
-              <w:rPr>
-                <w:noProof/>
-                <w:webHidden/>
-              </w:rPr>
-              <w:t>8</w:t>
             </w:r>
             <w:r>
               <w:rPr>
@@ -2355,13 +1548,15 @@
               <w:lang w:eastAsia="en-IE"/>
             </w:rPr>
           </w:pPr>
-          <w:hyperlink w:anchor="_Toc242732597" w:history="1">
+          <w:hyperlink w:anchor="_Toc242948922" w:history="1">
             <w:r>
               <w:rPr>
                 <w:rStyle w:val="Hyperlink"/>
-                <w:noProof/>
-              </w:rPr>
-              <w:t>8.</w:t>
+                <w:b/>
+                <w:bCs/>
+                <w:noProof/>
+              </w:rPr>
+              <w:t>3.</w:t>
             </w:r>
             <w:r>
               <w:rPr>
@@ -2374,9 +1569,11 @@
             <w:r>
               <w:rPr>
                 <w:rStyle w:val="Hyperlink"/>
-                <w:noProof/>
-              </w:rPr>
-              <w:t>Expected Deliverables</w:t>
+                <w:b/>
+                <w:bCs/>
+                <w:noProof/>
+              </w:rPr>
+              <w:t>Aim and Objectives</w:t>
             </w:r>
             <w:r>
               <w:rPr>
@@ -2397,7 +1594,7 @@
                 <w:noProof/>
                 <w:webHidden/>
               </w:rPr>
-              <w:instrText xml:space="preserve"> PAGEREF _Toc242732597 \h </w:instrText>
+              <w:instrText xml:space="preserve"> PAGEREF _Toc242948922 \h </w:instrText>
             </w:r>
             <w:r>
               <w:rPr>
@@ -2417,7 +1614,639 @@
                 <w:noProof/>
                 <w:webHidden/>
               </w:rPr>
-              <w:t>9</w:t>
+              <w:t>6</w:t>
+            </w:r>
+            <w:r>
+              <w:rPr>
+                <w:noProof/>
+                <w:webHidden/>
+              </w:rPr>
+              <w:fldChar w:fldCharType="end"/>
+            </w:r>
+          </w:hyperlink>
+        </w:p>
+        <w:p>
+          <w:pPr>
+            <w:pStyle w:val="TOC2"/>
+            <w:tabs>
+              <w:tab w:val="right" w:leader="dot" w:pos="9016"/>
+            </w:tabs>
+            <w:rPr>
+              <w:rFonts w:eastAsiaTheme="minorEastAsia"/>
+              <w:noProof/>
+              <w:lang w:eastAsia="en-IE"/>
+            </w:rPr>
+          </w:pPr>
+          <w:hyperlink w:anchor="_Toc242948923" w:history="1">
+            <w:r>
+              <w:rPr>
+                <w:rStyle w:val="Hyperlink"/>
+                <w:noProof/>
+              </w:rPr>
+              <w:t>3.1 Aim</w:t>
+            </w:r>
+            <w:r>
+              <w:rPr>
+                <w:noProof/>
+                <w:webHidden/>
+              </w:rPr>
+              <w:tab/>
+            </w:r>
+            <w:r>
+              <w:rPr>
+                <w:noProof/>
+                <w:webHidden/>
+              </w:rPr>
+              <w:fldChar w:fldCharType="begin"/>
+            </w:r>
+            <w:r>
+              <w:rPr>
+                <w:noProof/>
+                <w:webHidden/>
+              </w:rPr>
+              <w:instrText xml:space="preserve"> PAGEREF _Toc242948923 \h </w:instrText>
+            </w:r>
+            <w:r>
+              <w:rPr>
+                <w:noProof/>
+                <w:webHidden/>
+              </w:rPr>
+            </w:r>
+            <w:r>
+              <w:rPr>
+                <w:noProof/>
+                <w:webHidden/>
+              </w:rPr>
+              <w:fldChar w:fldCharType="separate"/>
+            </w:r>
+            <w:r>
+              <w:rPr>
+                <w:noProof/>
+                <w:webHidden/>
+              </w:rPr>
+              <w:t>6</w:t>
+            </w:r>
+            <w:r>
+              <w:rPr>
+                <w:noProof/>
+                <w:webHidden/>
+              </w:rPr>
+              <w:fldChar w:fldCharType="end"/>
+            </w:r>
+          </w:hyperlink>
+        </w:p>
+        <w:p>
+          <w:pPr>
+            <w:pStyle w:val="TOC2"/>
+            <w:tabs>
+              <w:tab w:val="right" w:leader="dot" w:pos="9016"/>
+            </w:tabs>
+            <w:rPr>
+              <w:rFonts w:eastAsiaTheme="minorEastAsia"/>
+              <w:noProof/>
+              <w:lang w:eastAsia="en-IE"/>
+            </w:rPr>
+          </w:pPr>
+          <w:hyperlink w:anchor="_Toc242948924" w:history="1">
+            <w:r>
+              <w:rPr>
+                <w:rStyle w:val="Hyperlink"/>
+                <w:noProof/>
+              </w:rPr>
+              <w:t>3.2 Objectives</w:t>
+            </w:r>
+            <w:r>
+              <w:rPr>
+                <w:noProof/>
+                <w:webHidden/>
+              </w:rPr>
+              <w:tab/>
+            </w:r>
+            <w:r>
+              <w:rPr>
+                <w:noProof/>
+                <w:webHidden/>
+              </w:rPr>
+              <w:fldChar w:fldCharType="begin"/>
+            </w:r>
+            <w:r>
+              <w:rPr>
+                <w:noProof/>
+                <w:webHidden/>
+              </w:rPr>
+              <w:instrText xml:space="preserve"> PAGEREF _Toc242948924 \h </w:instrText>
+            </w:r>
+            <w:r>
+              <w:rPr>
+                <w:noProof/>
+                <w:webHidden/>
+              </w:rPr>
+            </w:r>
+            <w:r>
+              <w:rPr>
+                <w:noProof/>
+                <w:webHidden/>
+              </w:rPr>
+              <w:fldChar w:fldCharType="separate"/>
+            </w:r>
+            <w:r>
+              <w:rPr>
+                <w:noProof/>
+                <w:webHidden/>
+              </w:rPr>
+              <w:t>6</w:t>
+            </w:r>
+            <w:r>
+              <w:rPr>
+                <w:noProof/>
+                <w:webHidden/>
+              </w:rPr>
+              <w:fldChar w:fldCharType="end"/>
+            </w:r>
+          </w:hyperlink>
+        </w:p>
+        <w:p>
+          <w:pPr>
+            <w:pStyle w:val="TOC2"/>
+            <w:tabs>
+              <w:tab w:val="right" w:leader="dot" w:pos="9016"/>
+            </w:tabs>
+            <w:rPr>
+              <w:rFonts w:eastAsiaTheme="minorEastAsia"/>
+              <w:noProof/>
+              <w:lang w:eastAsia="en-IE"/>
+            </w:rPr>
+          </w:pPr>
+          <w:hyperlink w:anchor="_Toc242948925" w:history="1">
+            <w:r>
+              <w:rPr>
+                <w:rStyle w:val="Hyperlink"/>
+                <w:noProof/>
+              </w:rPr>
+              <w:t>3.3 Business Hypothesis</w:t>
+            </w:r>
+            <w:r>
+              <w:rPr>
+                <w:noProof/>
+                <w:webHidden/>
+              </w:rPr>
+              <w:tab/>
+            </w:r>
+            <w:r>
+              <w:rPr>
+                <w:noProof/>
+                <w:webHidden/>
+              </w:rPr>
+              <w:fldChar w:fldCharType="begin"/>
+            </w:r>
+            <w:r>
+              <w:rPr>
+                <w:noProof/>
+                <w:webHidden/>
+              </w:rPr>
+              <w:instrText xml:space="preserve"> PAGEREF _Toc242948925 \h </w:instrText>
+            </w:r>
+            <w:r>
+              <w:rPr>
+                <w:noProof/>
+                <w:webHidden/>
+              </w:rPr>
+            </w:r>
+            <w:r>
+              <w:rPr>
+                <w:noProof/>
+                <w:webHidden/>
+              </w:rPr>
+              <w:fldChar w:fldCharType="separate"/>
+            </w:r>
+            <w:r>
+              <w:rPr>
+                <w:noProof/>
+                <w:webHidden/>
+              </w:rPr>
+              <w:t>6</w:t>
+            </w:r>
+            <w:r>
+              <w:rPr>
+                <w:noProof/>
+                <w:webHidden/>
+              </w:rPr>
+              <w:fldChar w:fldCharType="end"/>
+            </w:r>
+          </w:hyperlink>
+        </w:p>
+        <w:p>
+          <w:pPr>
+            <w:pStyle w:val="TOC1"/>
+            <w:tabs>
+              <w:tab w:val="right" w:leader="dot" w:pos="9016"/>
+            </w:tabs>
+            <w:rPr>
+              <w:rFonts w:eastAsiaTheme="minorEastAsia"/>
+              <w:noProof/>
+              <w:lang w:eastAsia="en-IE"/>
+            </w:rPr>
+          </w:pPr>
+          <w:hyperlink w:anchor="_Toc242948926" w:history="1">
+            <w:r>
+              <w:rPr>
+                <w:rStyle w:val="Hyperlink"/>
+                <w:noProof/>
+              </w:rPr>
+              <w:t>4. Scope</w:t>
+            </w:r>
+            <w:r>
+              <w:rPr>
+                <w:noProof/>
+                <w:webHidden/>
+              </w:rPr>
+              <w:tab/>
+            </w:r>
+            <w:r>
+              <w:rPr>
+                <w:noProof/>
+                <w:webHidden/>
+              </w:rPr>
+              <w:fldChar w:fldCharType="begin"/>
+            </w:r>
+            <w:r>
+              <w:rPr>
+                <w:noProof/>
+                <w:webHidden/>
+              </w:rPr>
+              <w:instrText xml:space="preserve"> PAGEREF _Toc242948926 \h </w:instrText>
+            </w:r>
+            <w:r>
+              <w:rPr>
+                <w:noProof/>
+                <w:webHidden/>
+              </w:rPr>
+            </w:r>
+            <w:r>
+              <w:rPr>
+                <w:noProof/>
+                <w:webHidden/>
+              </w:rPr>
+              <w:fldChar w:fldCharType="separate"/>
+            </w:r>
+            <w:r>
+              <w:rPr>
+                <w:noProof/>
+                <w:webHidden/>
+              </w:rPr>
+              <w:t>6</w:t>
+            </w:r>
+            <w:r>
+              <w:rPr>
+                <w:noProof/>
+                <w:webHidden/>
+              </w:rPr>
+              <w:fldChar w:fldCharType="end"/>
+            </w:r>
+          </w:hyperlink>
+        </w:p>
+        <w:p>
+          <w:pPr>
+            <w:pStyle w:val="TOC1"/>
+            <w:tabs>
+              <w:tab w:val="right" w:leader="dot" w:pos="9016"/>
+            </w:tabs>
+            <w:rPr>
+              <w:rFonts w:eastAsiaTheme="minorEastAsia"/>
+              <w:noProof/>
+              <w:lang w:eastAsia="en-IE"/>
+            </w:rPr>
+          </w:pPr>
+          <w:hyperlink w:anchor="_Toc242948927" w:history="1">
+            <w:r>
+              <w:rPr>
+                <w:rStyle w:val="Hyperlink"/>
+                <w:b/>
+                <w:bCs/>
+                <w:noProof/>
+              </w:rPr>
+              <w:t>5.Methodology</w:t>
+            </w:r>
+            <w:r>
+              <w:rPr>
+                <w:noProof/>
+                <w:webHidden/>
+              </w:rPr>
+              <w:tab/>
+            </w:r>
+            <w:r>
+              <w:rPr>
+                <w:noProof/>
+                <w:webHidden/>
+              </w:rPr>
+              <w:fldChar w:fldCharType="begin"/>
+            </w:r>
+            <w:r>
+              <w:rPr>
+                <w:noProof/>
+                <w:webHidden/>
+              </w:rPr>
+              <w:instrText xml:space="preserve"> PAGEREF _Toc242948927 \h </w:instrText>
+            </w:r>
+            <w:r>
+              <w:rPr>
+                <w:noProof/>
+                <w:webHidden/>
+              </w:rPr>
+            </w:r>
+            <w:r>
+              <w:rPr>
+                <w:noProof/>
+                <w:webHidden/>
+              </w:rPr>
+              <w:fldChar w:fldCharType="separate"/>
+            </w:r>
+            <w:r>
+              <w:rPr>
+                <w:noProof/>
+                <w:webHidden/>
+              </w:rPr>
+              <w:t>7</w:t>
+            </w:r>
+            <w:r>
+              <w:rPr>
+                <w:noProof/>
+                <w:webHidden/>
+              </w:rPr>
+              <w:fldChar w:fldCharType="end"/>
+            </w:r>
+          </w:hyperlink>
+        </w:p>
+        <w:p>
+          <w:pPr>
+            <w:pStyle w:val="TOC2"/>
+            <w:tabs>
+              <w:tab w:val="right" w:leader="dot" w:pos="9016"/>
+            </w:tabs>
+            <w:rPr>
+              <w:rFonts w:eastAsiaTheme="minorEastAsia"/>
+              <w:noProof/>
+              <w:lang w:eastAsia="en-IE"/>
+            </w:rPr>
+          </w:pPr>
+          <w:hyperlink w:anchor="_Toc242948928" w:history="1">
+            <w:r>
+              <w:rPr>
+                <w:rStyle w:val="Hyperlink"/>
+                <w:noProof/>
+              </w:rPr>
+              <w:t>5.1 Data Preparation and Exploratory Analysis</w:t>
+            </w:r>
+            <w:r>
+              <w:rPr>
+                <w:noProof/>
+                <w:webHidden/>
+              </w:rPr>
+              <w:tab/>
+            </w:r>
+            <w:r>
+              <w:rPr>
+                <w:noProof/>
+                <w:webHidden/>
+              </w:rPr>
+              <w:fldChar w:fldCharType="begin"/>
+            </w:r>
+            <w:r>
+              <w:rPr>
+                <w:noProof/>
+                <w:webHidden/>
+              </w:rPr>
+              <w:instrText xml:space="preserve"> PAGEREF _Toc242948928 \h </w:instrText>
+            </w:r>
+            <w:r>
+              <w:rPr>
+                <w:noProof/>
+                <w:webHidden/>
+              </w:rPr>
+            </w:r>
+            <w:r>
+              <w:rPr>
+                <w:noProof/>
+                <w:webHidden/>
+              </w:rPr>
+              <w:fldChar w:fldCharType="separate"/>
+            </w:r>
+            <w:r>
+              <w:rPr>
+                <w:noProof/>
+                <w:webHidden/>
+              </w:rPr>
+              <w:t>7</w:t>
+            </w:r>
+            <w:r>
+              <w:rPr>
+                <w:noProof/>
+                <w:webHidden/>
+              </w:rPr>
+              <w:fldChar w:fldCharType="end"/>
+            </w:r>
+          </w:hyperlink>
+        </w:p>
+        <w:p>
+          <w:pPr>
+            <w:pStyle w:val="TOC2"/>
+            <w:tabs>
+              <w:tab w:val="right" w:leader="dot" w:pos="9016"/>
+            </w:tabs>
+            <w:rPr>
+              <w:rFonts w:eastAsiaTheme="minorEastAsia"/>
+              <w:noProof/>
+              <w:lang w:eastAsia="en-IE"/>
+            </w:rPr>
+          </w:pPr>
+          <w:hyperlink w:anchor="_Toc242948929" w:history="1">
+            <w:r>
+              <w:rPr>
+                <w:rStyle w:val="Hyperlink"/>
+                <w:noProof/>
+              </w:rPr>
+              <w:t>5.2 Predictive Modelling</w:t>
+            </w:r>
+            <w:r>
+              <w:rPr>
+                <w:noProof/>
+                <w:webHidden/>
+              </w:rPr>
+              <w:tab/>
+            </w:r>
+            <w:r>
+              <w:rPr>
+                <w:noProof/>
+                <w:webHidden/>
+              </w:rPr>
+              <w:fldChar w:fldCharType="begin"/>
+            </w:r>
+            <w:r>
+              <w:rPr>
+                <w:noProof/>
+                <w:webHidden/>
+              </w:rPr>
+              <w:instrText xml:space="preserve"> PAGEREF _Toc242948929 \h </w:instrText>
+            </w:r>
+            <w:r>
+              <w:rPr>
+                <w:noProof/>
+                <w:webHidden/>
+              </w:rPr>
+            </w:r>
+            <w:r>
+              <w:rPr>
+                <w:noProof/>
+                <w:webHidden/>
+              </w:rPr>
+              <w:fldChar w:fldCharType="separate"/>
+            </w:r>
+            <w:r>
+              <w:rPr>
+                <w:noProof/>
+                <w:webHidden/>
+              </w:rPr>
+              <w:t>7</w:t>
+            </w:r>
+            <w:r>
+              <w:rPr>
+                <w:noProof/>
+                <w:webHidden/>
+              </w:rPr>
+              <w:fldChar w:fldCharType="end"/>
+            </w:r>
+          </w:hyperlink>
+        </w:p>
+        <w:p>
+          <w:pPr>
+            <w:pStyle w:val="TOC2"/>
+            <w:tabs>
+              <w:tab w:val="right" w:leader="dot" w:pos="9016"/>
+            </w:tabs>
+            <w:rPr>
+              <w:rFonts w:eastAsiaTheme="minorEastAsia"/>
+              <w:noProof/>
+              <w:lang w:eastAsia="en-IE"/>
+            </w:rPr>
+          </w:pPr>
+          <w:hyperlink w:anchor="_Toc242948930" w:history="1">
+            <w:r>
+              <w:rPr>
+                <w:rStyle w:val="Hyperlink"/>
+                <w:noProof/>
+              </w:rPr>
+              <w:t>5.3 Connection Risk Assessment</w:t>
+            </w:r>
+            <w:r>
+              <w:rPr>
+                <w:noProof/>
+                <w:webHidden/>
+              </w:rPr>
+              <w:tab/>
+            </w:r>
+            <w:r>
+              <w:rPr>
+                <w:noProof/>
+                <w:webHidden/>
+              </w:rPr>
+              <w:fldChar w:fldCharType="begin"/>
+            </w:r>
+            <w:r>
+              <w:rPr>
+                <w:noProof/>
+                <w:webHidden/>
+              </w:rPr>
+              <w:instrText xml:space="preserve"> PAGEREF _Toc242948930 \h </w:instrText>
+            </w:r>
+            <w:r>
+              <w:rPr>
+                <w:noProof/>
+                <w:webHidden/>
+              </w:rPr>
+            </w:r>
+            <w:r>
+              <w:rPr>
+                <w:noProof/>
+                <w:webHidden/>
+              </w:rPr>
+              <w:fldChar w:fldCharType="separate"/>
+            </w:r>
+            <w:r>
+              <w:rPr>
+                <w:noProof/>
+                <w:webHidden/>
+              </w:rPr>
+              <w:t>7</w:t>
+            </w:r>
+            <w:r>
+              <w:rPr>
+                <w:noProof/>
+                <w:webHidden/>
+              </w:rPr>
+              <w:fldChar w:fldCharType="end"/>
+            </w:r>
+          </w:hyperlink>
+        </w:p>
+        <w:p>
+          <w:pPr>
+            <w:pStyle w:val="TOC2"/>
+            <w:tabs>
+              <w:tab w:val="right" w:leader="dot" w:pos="9016"/>
+            </w:tabs>
+            <w:rPr>
+              <w:rFonts w:eastAsiaTheme="minorEastAsia"/>
+              <w:noProof/>
+              <w:lang w:eastAsia="en-IE"/>
+            </w:rPr>
+          </w:pPr>
+          <w:hyperlink w:anchor="_Toc242948931" w:history="1">
+            <w:r>
+              <w:rPr>
+                <w:rStyle w:val="Hyperlink"/>
+                <w:noProof/>
+              </w:rPr>
+              <w:t>5.4 Technologies and Tools</w:t>
+            </w:r>
+            <w:r>
+              <w:rPr>
+                <w:noProof/>
+                <w:webHidden/>
+              </w:rPr>
+              <w:tab/>
+            </w:r>
+            <w:r>
+              <w:rPr>
+                <w:noProof/>
+                <w:webHidden/>
+              </w:rPr>
+              <w:fldChar w:fldCharType="begin"/>
+            </w:r>
+            <w:r>
+              <w:rPr>
+                <w:noProof/>
+                <w:webHidden/>
+              </w:rPr>
+              <w:instrText xml:space="preserve"> PAGEREF _Toc242948931 \h </w:instrText>
+            </w:r>
+            <w:r>
+              <w:rPr>
+                <w:noProof/>
+                <w:webHidden/>
+              </w:rPr>
+            </w:r>
+            <w:r>
+              <w:rPr>
+                <w:noProof/>
+                <w:webHidden/>
+              </w:rPr>
+              <w:fldChar w:fldCharType="separate"/>
+            </w:r>
+            <w:r>
+              <w:rPr>
+                <w:noProof/>
+                <w:webHidden/>
+              </w:rPr>
+              <w:t>8</w:t>
             </w:r>
             <w:r>
               <w:rPr>
@@ -2441,12 +2270,270 @@
               <w:lang w:eastAsia="en-IE"/>
             </w:rPr>
           </w:pPr>
-          <w:hyperlink w:anchor="_Toc242732598" w:history="1">
+          <w:hyperlink w:anchor="_Toc242948932" w:history="1">
             <w:r>
               <w:rPr>
                 <w:rStyle w:val="Hyperlink"/>
                 <w:noProof/>
               </w:rPr>
+              <w:t>6.</w:t>
+            </w:r>
+            <w:r>
+              <w:rPr>
+                <w:rFonts w:eastAsiaTheme="minorEastAsia"/>
+                <w:noProof/>
+                <w:lang w:eastAsia="en-IE"/>
+              </w:rPr>
+              <w:tab/>
+            </w:r>
+            <w:r>
+              <w:rPr>
+                <w:rStyle w:val="Hyperlink"/>
+                <w:noProof/>
+              </w:rPr>
+              <w:t>High-Level Architecture</w:t>
+            </w:r>
+            <w:r>
+              <w:rPr>
+                <w:noProof/>
+                <w:webHidden/>
+              </w:rPr>
+              <w:tab/>
+            </w:r>
+            <w:r>
+              <w:rPr>
+                <w:noProof/>
+                <w:webHidden/>
+              </w:rPr>
+              <w:fldChar w:fldCharType="begin"/>
+            </w:r>
+            <w:r>
+              <w:rPr>
+                <w:noProof/>
+                <w:webHidden/>
+              </w:rPr>
+              <w:instrText xml:space="preserve"> PAGEREF _Toc242948932 \h </w:instrText>
+            </w:r>
+            <w:r>
+              <w:rPr>
+                <w:noProof/>
+                <w:webHidden/>
+              </w:rPr>
+            </w:r>
+            <w:r>
+              <w:rPr>
+                <w:noProof/>
+                <w:webHidden/>
+              </w:rPr>
+              <w:fldChar w:fldCharType="separate"/>
+            </w:r>
+            <w:r>
+              <w:rPr>
+                <w:noProof/>
+                <w:webHidden/>
+              </w:rPr>
+              <w:t>8</w:t>
+            </w:r>
+            <w:r>
+              <w:rPr>
+                <w:noProof/>
+                <w:webHidden/>
+              </w:rPr>
+              <w:fldChar w:fldCharType="end"/>
+            </w:r>
+          </w:hyperlink>
+        </w:p>
+        <w:p>
+          <w:pPr>
+            <w:pStyle w:val="TOC1"/>
+            <w:tabs>
+              <w:tab w:val="left" w:pos="480"/>
+              <w:tab w:val="right" w:leader="dot" w:pos="9016"/>
+            </w:tabs>
+            <w:rPr>
+              <w:rFonts w:eastAsiaTheme="minorEastAsia"/>
+              <w:noProof/>
+              <w:lang w:eastAsia="en-IE"/>
+            </w:rPr>
+          </w:pPr>
+          <w:hyperlink w:anchor="_Toc242948933" w:history="1">
+            <w:r>
+              <w:rPr>
+                <w:rStyle w:val="Hyperlink"/>
+                <w:noProof/>
+              </w:rPr>
+              <w:t>7.</w:t>
+            </w:r>
+            <w:r>
+              <w:rPr>
+                <w:rFonts w:eastAsiaTheme="minorEastAsia"/>
+                <w:noProof/>
+                <w:lang w:eastAsia="en-IE"/>
+              </w:rPr>
+              <w:tab/>
+            </w:r>
+            <w:r>
+              <w:rPr>
+                <w:rStyle w:val="Hyperlink"/>
+                <w:noProof/>
+              </w:rPr>
+              <w:t>Data Sources</w:t>
+            </w:r>
+            <w:r>
+              <w:rPr>
+                <w:noProof/>
+                <w:webHidden/>
+              </w:rPr>
+              <w:tab/>
+            </w:r>
+            <w:r>
+              <w:rPr>
+                <w:noProof/>
+                <w:webHidden/>
+              </w:rPr>
+              <w:fldChar w:fldCharType="begin"/>
+            </w:r>
+            <w:r>
+              <w:rPr>
+                <w:noProof/>
+                <w:webHidden/>
+              </w:rPr>
+              <w:instrText xml:space="preserve"> PAGEREF _Toc242948933 \h </w:instrText>
+            </w:r>
+            <w:r>
+              <w:rPr>
+                <w:noProof/>
+                <w:webHidden/>
+              </w:rPr>
+            </w:r>
+            <w:r>
+              <w:rPr>
+                <w:noProof/>
+                <w:webHidden/>
+              </w:rPr>
+              <w:fldChar w:fldCharType="separate"/>
+            </w:r>
+            <w:r>
+              <w:rPr>
+                <w:noProof/>
+                <w:webHidden/>
+              </w:rPr>
+              <w:t>9</w:t>
+            </w:r>
+            <w:r>
+              <w:rPr>
+                <w:noProof/>
+                <w:webHidden/>
+              </w:rPr>
+              <w:fldChar w:fldCharType="end"/>
+            </w:r>
+          </w:hyperlink>
+        </w:p>
+        <w:p>
+          <w:pPr>
+            <w:pStyle w:val="TOC1"/>
+            <w:tabs>
+              <w:tab w:val="left" w:pos="480"/>
+              <w:tab w:val="right" w:leader="dot" w:pos="9016"/>
+            </w:tabs>
+            <w:rPr>
+              <w:rFonts w:eastAsiaTheme="minorEastAsia"/>
+              <w:noProof/>
+              <w:lang w:eastAsia="en-IE"/>
+            </w:rPr>
+          </w:pPr>
+          <w:hyperlink w:anchor="_Toc242948934" w:history="1">
+            <w:r>
+              <w:rPr>
+                <w:rStyle w:val="Hyperlink"/>
+                <w:noProof/>
+              </w:rPr>
+              <w:t>8.</w:t>
+            </w:r>
+            <w:r>
+              <w:rPr>
+                <w:rFonts w:eastAsiaTheme="minorEastAsia"/>
+                <w:noProof/>
+                <w:lang w:eastAsia="en-IE"/>
+              </w:rPr>
+              <w:tab/>
+            </w:r>
+            <w:r>
+              <w:rPr>
+                <w:rStyle w:val="Hyperlink"/>
+                <w:noProof/>
+              </w:rPr>
+              <w:t>Expected Deliverables</w:t>
+            </w:r>
+            <w:r>
+              <w:rPr>
+                <w:noProof/>
+                <w:webHidden/>
+              </w:rPr>
+              <w:tab/>
+            </w:r>
+            <w:r>
+              <w:rPr>
+                <w:noProof/>
+                <w:webHidden/>
+              </w:rPr>
+              <w:fldChar w:fldCharType="begin"/>
+            </w:r>
+            <w:r>
+              <w:rPr>
+                <w:noProof/>
+                <w:webHidden/>
+              </w:rPr>
+              <w:instrText xml:space="preserve"> PAGEREF _Toc242948934 \h </w:instrText>
+            </w:r>
+            <w:r>
+              <w:rPr>
+                <w:noProof/>
+                <w:webHidden/>
+              </w:rPr>
+            </w:r>
+            <w:r>
+              <w:rPr>
+                <w:noProof/>
+                <w:webHidden/>
+              </w:rPr>
+              <w:fldChar w:fldCharType="separate"/>
+            </w:r>
+            <w:r>
+              <w:rPr>
+                <w:noProof/>
+                <w:webHidden/>
+              </w:rPr>
+              <w:t>9</w:t>
+            </w:r>
+            <w:r>
+              <w:rPr>
+                <w:noProof/>
+                <w:webHidden/>
+              </w:rPr>
+              <w:fldChar w:fldCharType="end"/>
+            </w:r>
+          </w:hyperlink>
+        </w:p>
+        <w:p>
+          <w:pPr>
+            <w:pStyle w:val="TOC1"/>
+            <w:tabs>
+              <w:tab w:val="left" w:pos="480"/>
+              <w:tab w:val="right" w:leader="dot" w:pos="9016"/>
+            </w:tabs>
+            <w:rPr>
+              <w:rFonts w:eastAsiaTheme="minorEastAsia"/>
+              <w:noProof/>
+              <w:lang w:eastAsia="en-IE"/>
+            </w:rPr>
+          </w:pPr>
+          <w:hyperlink w:anchor="_Toc242948935" w:history="1">
+            <w:r>
+              <w:rPr>
+                <w:rStyle w:val="Hyperlink"/>
+                <w:noProof/>
+              </w:rPr>
               <w:t>9.</w:t>
             </w:r>
             <w:r>
@@ -2483,7 +2570,7 @@
                 <w:noProof/>
                 <w:webHidden/>
               </w:rPr>
-              <w:instrText xml:space="preserve"> PAGEREF _Toc242732598 \h </w:instrText>
+              <w:instrText xml:space="preserve"> PAGEREF _Toc242948935 \h </w:instrText>
             </w:r>
             <w:r>
               <w:rPr>
@@ -2526,7 +2613,7 @@
               <w:lang w:eastAsia="en-IE"/>
             </w:rPr>
           </w:pPr>
-          <w:hyperlink w:anchor="_Toc242732599" w:history="1">
+          <w:hyperlink w:anchor="_Toc242948936" w:history="1">
             <w:r>
               <w:rPr>
                 <w:rStyle w:val="Hyperlink"/>
@@ -2569,7 +2656,7 @@
                 <w:noProof/>
                 <w:webHidden/>
               </w:rPr>
-              <w:instrText xml:space="preserve"> PAGEREF _Toc242732599 \h </w:instrText>
+              <w:instrText xml:space="preserve"> PAGEREF _Toc242948936 \h </w:instrText>
             </w:r>
             <w:r>
               <w:rPr>
@@ -2589,7 +2676,7 @@
                 <w:noProof/>
                 <w:webHidden/>
               </w:rPr>
-              <w:t>10</w:t>
+              <w:t>11</w:t>
             </w:r>
             <w:r>
               <w:rPr>
@@ -2612,7 +2699,7 @@
               <w:lang w:eastAsia="en-IE"/>
             </w:rPr>
           </w:pPr>
-          <w:hyperlink w:anchor="_Toc242732600" w:history="1">
+          <w:hyperlink w:anchor="_Toc242948937" w:history="1">
             <w:r>
               <w:rPr>
                 <w:rStyle w:val="Hyperlink"/>
@@ -2639,7 +2726,7 @@
                 <w:noProof/>
                 <w:webHidden/>
               </w:rPr>
-              <w:instrText xml:space="preserve"> PAGEREF _Toc242732600 \h </w:instrText>
+              <w:instrText xml:space="preserve"> PAGEREF _Toc242948937 \h </w:instrText>
             </w:r>
             <w:r>
               <w:rPr>
@@ -2659,7 +2746,7 @@
                 <w:noProof/>
                 <w:webHidden/>
               </w:rPr>
-              <w:t>10</w:t>
+              <w:t>11</w:t>
             </w:r>
             <w:r>
               <w:rPr>
@@ -2682,7 +2769,7 @@
               <w:lang w:eastAsia="en-IE"/>
             </w:rPr>
           </w:pPr>
-          <w:hyperlink w:anchor="_Toc242732601" w:history="1">
+          <w:hyperlink w:anchor="_Toc242948938" w:history="1">
             <w:r>
               <w:rPr>
                 <w:rStyle w:val="Hyperlink"/>
@@ -2709,7 +2796,7 @@
                 <w:noProof/>
                 <w:webHidden/>
               </w:rPr>
-              <w:instrText xml:space="preserve"> PAGEREF _Toc242732601 \h </w:instrText>
+              <w:instrText xml:space="preserve"> PAGEREF _Toc242948938 \h </w:instrText>
             </w:r>
             <w:r>
               <w:rPr>
@@ -2729,7 +2816,7 @@
                 <w:noProof/>
                 <w:webHidden/>
               </w:rPr>
-              <w:t>11</w:t>
+              <w:t>12</w:t>
             </w:r>
             <w:r>
               <w:rPr>
@@ -2790,17 +2877,20 @@
     <w:p>
       <w:pPr>
         <w:rPr>
-          <w:color w:val="3A3A3A"/>
+          <w:rFonts w:asciiTheme="majorHAnsi" w:eastAsiaTheme="majorEastAsia" w:hAnsiTheme="majorHAnsi" w:cstheme="majorBidi"/>
+          <w:color w:val="0F4761" w:themeColor="accent1" w:themeShade="BF"/>
           <w:sz w:val="40"/>
           <w:szCs w:val="40"/>
         </w:rPr>
       </w:pPr>
       <w:r>
         <w:rPr>
-          <w:color w:val="3A3A3A"/>
+          <w:rFonts w:asciiTheme="majorHAnsi" w:eastAsiaTheme="majorEastAsia" w:hAnsiTheme="majorHAnsi" w:cstheme="majorBidi"/>
+          <w:color w:val="0F4761" w:themeColor="accent1" w:themeShade="BF"/>
           <w:sz w:val="40"/>
           <w:szCs w:val="40"/>
         </w:rPr>
+        <w:lastRenderedPageBreak/>
         <w:t>Abstract</w:t>
       </w:r>
     </w:p>
@@ -2853,7 +2943,7 @@
         <w:spacing w:after="0"/>
       </w:pPr>
       <w:bookmarkStart w:id="5" w:name="_Toc242717966"/>
-      <w:bookmarkStart w:id="6" w:name="_Toc242732583"/>
+      <w:bookmarkStart w:id="6" w:name="_Toc242948920"/>
       <w:r>
         <w:lastRenderedPageBreak/>
         <w:t>Introduction</w:t>
@@ -2861,7 +2951,6 @@
       <w:bookmarkEnd w:id="5"/>
       <w:bookmarkEnd w:id="6"/>
     </w:p>
-    <w:p/>
     <w:p>
       <w:r>
         <w:t>I chose this topic because I really enjoy travelling, and when I have a connecting flight, delays are always something I think about. Even a small delay can sometimes leave very little time to catch the next flight. I started wondering if data could help understand when a connection might be at risk.</w:t>
@@ -2895,7 +2984,7 @@
         </w:numPr>
         <w:spacing w:after="0"/>
       </w:pPr>
-      <w:bookmarkStart w:id="7" w:name="_Toc242732584"/>
+      <w:bookmarkStart w:id="7" w:name="_Toc242948921"/>
       <w:r>
         <w:t>Problem Definition</w:t>
       </w:r>
@@ -2906,10 +2995,6 @@
         <w:t xml:space="preserve">Flight delays can have a significant impact on passengers travelling on connecting itineraries </w:t>
       </w:r>
       <w:r>
-        <w:rPr>
-          <w:b/>
-          <w:bCs/>
-        </w:rPr>
         <w:t>(Guimarães, Soares and Ventura, 2022).</w:t>
       </w:r>
       <w:r>
@@ -2939,20 +3024,26 @@
     <w:p>
       <w:pPr>
         <w:pStyle w:val="Heading1"/>
+        <w:numPr>
+          <w:ilvl w:val="0"/>
+          <w:numId w:val="2"/>
+        </w:numPr>
         <w:tabs>
           <w:tab w:val="left" w:pos="2904"/>
         </w:tabs>
         <w:spacing w:before="0"/>
-      </w:pPr>
-      <w:bookmarkStart w:id="8" w:name="_Toc242732585"/>
-      <w:r>
-        <w:t xml:space="preserve">3. </w:t>
-      </w:r>
-      <w:r>
         <w:rPr>
           <w:b/>
           <w:bCs/>
         </w:rPr>
+      </w:pPr>
+      <w:bookmarkStart w:id="8" w:name="_Toc242948922"/>
+      <w:r>
+        <w:rPr>
+          <w:b/>
+          <w:bCs/>
+        </w:rPr>
+        <w:lastRenderedPageBreak/>
         <w:t>Aim and Objectives</w:t>
       </w:r>
       <w:bookmarkEnd w:id="8"/>
@@ -2961,7 +3052,7 @@
       <w:pPr>
         <w:pStyle w:val="Heading2"/>
       </w:pPr>
-      <w:bookmarkStart w:id="9" w:name="_Toc242732586"/>
+      <w:bookmarkStart w:id="9" w:name="_Toc242948923"/>
       <w:r>
         <w:t>3.1 Aim</w:t>
       </w:r>
@@ -2972,11 +3063,12 @@
         <w:t>The aim of this project is to investigate whether historical airline operational data can be used to predict arrival delays and use these predictions to assess potential flight connection risk.</w:t>
       </w:r>
     </w:p>
+    <w:p/>
     <w:p>
       <w:pPr>
         <w:pStyle w:val="Heading2"/>
       </w:pPr>
-      <w:bookmarkStart w:id="10" w:name="_Toc242732587"/>
+      <w:bookmarkStart w:id="10" w:name="_Toc242948924"/>
       <w:r>
         <w:t>3.2 Objectives</w:t>
       </w:r>
@@ -3041,7 +3133,7 @@
       <w:pPr>
         <w:pStyle w:val="Heading2"/>
       </w:pPr>
-      <w:bookmarkStart w:id="11" w:name="_Toc242732588"/>
+      <w:bookmarkStart w:id="11" w:name="_Toc242948925"/>
       <w:r>
         <w:t xml:space="preserve">3.3 </w:t>
       </w:r>
@@ -3064,7 +3156,7 @@
         </w:tabs>
         <w:spacing w:before="0"/>
       </w:pPr>
-      <w:bookmarkStart w:id="12" w:name="_Toc242732589"/>
+      <w:bookmarkStart w:id="12" w:name="_Toc242948926"/>
       <w:r>
         <w:t>4. Scope</w:t>
       </w:r>
@@ -3072,7 +3164,10 @@
     </w:p>
     <w:p>
       <w:r>
-        <w:t>The project will focus on historical U.S. commercial airline operations using publicly available data from the U.S. Bureau of Transportation Statistics (BTS). The analysis will consider variables such as airlines, routes, scheduled flight times, distance and flight delays.</w:t>
+        <w:t>The project will focus on U.S. commercial airline operations for May 2026, using publicly available data from the U.S. Bureau of Transportation Statistics (BTS)</w:t>
+      </w:r>
+      <w:r>
+        <w:t>. The analysis will consider variables such as airlines, routes, scheduled flight times, distance and flight delays.</w:t>
       </w:r>
     </w:p>
     <w:p>
@@ -3105,7 +3200,7 @@
         <w:spacing w:before="0"/>
         <w:ind w:left="360"/>
       </w:pPr>
-      <w:bookmarkStart w:id="13" w:name="_Toc242732590"/>
+      <w:bookmarkStart w:id="13" w:name="_Toc242948927"/>
       <w:r>
         <w:rPr>
           <w:b/>
@@ -3127,7 +3222,7 @@
       <w:pPr>
         <w:pStyle w:val="Heading2"/>
       </w:pPr>
-      <w:bookmarkStart w:id="14" w:name="_Toc242732591"/>
+      <w:bookmarkStart w:id="14" w:name="_Toc242948928"/>
       <w:r>
         <w:t xml:space="preserve">5.1 </w:t>
       </w:r>
@@ -3137,27 +3232,19 @@
       <w:bookmarkEnd w:id="14"/>
     </w:p>
     <w:p>
-      <w:pPr>
-        <w:rPr>
-          <w:b/>
-          <w:bCs/>
-        </w:rPr>
-      </w:pPr>
-    </w:p>
-    <w:p>
-      <w:r>
-        <w:t>The first stage will involve collecting and preparing the historical airline data. The raw data will be processed using Python and checked for missing values, duplicates, data types and other possible data quality issues.</w:t>
-      </w:r>
-    </w:p>
-    <w:p>
-      <w:r>
-        <w:rPr>
-          <w:highlight w:val="yellow"/>
-        </w:rPr>
-        <w:t>Exploratory Data Analysis (EDA</w:t>
-      </w:r>
-      <w:r>
-        <w:t>) will then be used to understand the data and identify patterns in arrival delays. Operational factors such as route, airline, scheduled departure and arrival times, flight distance and travel period will be explored.</w:t>
+      <w:r>
+        <w:t xml:space="preserve">The first stage will involve collecting and preparing the historical airline data. The raw data will be processed using Python and checked for missing values, duplicates, data types and other possible data </w:t>
+      </w:r>
+      <w:r>
+        <w:t>quality issues.</w:t>
+      </w:r>
+    </w:p>
+    <w:p>
+      <w:r>
+        <w:t>Exploratory Data Analysis (EDA) will then be used to understand the data and identify</w:t>
+      </w:r>
+      <w:r>
+        <w:t xml:space="preserve"> patterns in arrival delays. Operational factors such as route, airline, scheduled departure and arrival times, flight distance and travel period will be explored.</w:t>
       </w:r>
     </w:p>
     <w:p/>
@@ -3165,7 +3252,7 @@
       <w:pPr>
         <w:pStyle w:val="Heading2"/>
       </w:pPr>
-      <w:bookmarkStart w:id="15" w:name="_Toc242732592"/>
+      <w:bookmarkStart w:id="15" w:name="_Toc242948929"/>
       <w:r>
         <w:t xml:space="preserve">5.2 </w:t>
       </w:r>
@@ -3173,19 +3260,47 @@
         <w:t>Predictive Modelling</w:t>
       </w:r>
       <w:bookmarkEnd w:id="15"/>
-      <w:r>
-        <w:br/>
-      </w:r>
-    </w:p>
-    <w:p>
-      <w:r>
-        <w:t xml:space="preserve">As the main value to be predicted is arrival delay measured in minutes, the predictive task will be treated as a regression problem. Different regression models will be developed and compared to identify the most suitable approach. Performance will be evaluated using regression metrics such as </w:t>
-      </w:r>
-      <w:r>
-        <w:rPr>
-          <w:highlight w:val="yellow"/>
-        </w:rPr>
-        <w:t>Mean Absolute Error (MAE), Root Mean Squared Error (RMSE) and R-squared (R²).</w:t>
+    </w:p>
+    <w:p>
+      <w:r>
+        <w:t>The main value I want to predict is the arrival delay in minutes, so I will use regression for this part of the project. Before building the models, I will decide which variables from the dataset are useful for predicting the arrival delay. I am particularly interested in looking at factors such as the airline, route, scheduled times and distance. I will then compare different regression models to understand which one gives the most useful predictions, especially for flights where even a small delay could affect the next connection.</w:t>
+      </w:r>
+    </w:p>
+    <w:p>
+      <w:pPr>
+        <w:pStyle w:val="Heading2"/>
+      </w:pPr>
+      <w:bookmarkStart w:id="16" w:name="_Toc242948930"/>
+      <w:r>
+        <w:t>5.</w:t>
+      </w:r>
+      <w:r>
+        <w:t>3 Connection Risk Assessment</w:t>
+      </w:r>
+      <w:bookmarkEnd w:id="16"/>
+    </w:p>
+    <w:p>
+      <w:r>
+        <w:t>Potential connecting flights will then be identified using scheduled flight information. Flights arriving and departing from the same airport within an appropriate connection window will be considered as potential connections. For each potential connection, the scheduled connection time will be calculated and compared with the predicted arrival delay to assess how much of the available connection time could be lost.</w:t>
+      </w:r>
+    </w:p>
+    <w:p>
+      <w:r>
+        <w:t>Where reliable Minimum Connection Time (MCT) information is available, this may also be considered when assessing the remaining connection buffer (International Air Transport Association, n.d.)</w:t>
+      </w:r>
+      <w:r>
+        <w:t>.</w:t>
+      </w:r>
+    </w:p>
+    <w:p>
+      <w:r>
+        <w:t>This approach will allow potential connection risk to be analysed without assuming that the flights represent an actual passenger itinerary.</w:t>
+      </w:r>
+    </w:p>
+    <w:p>
+      <w:r>
+        <w:lastRenderedPageBreak/>
+        <w:t>For me, this is an important part of the project because looking only at the number of minutes of delay does not show the full problem. A 20-minute delay could have very little impact on one connection but could make another connection much more difficult. For this reason, I want to look at the predicted delay together with the time available between the two flights.</w:t>
       </w:r>
     </w:p>
     <w:p/>
@@ -3193,95 +3308,47 @@
       <w:pPr>
         <w:pStyle w:val="Heading2"/>
       </w:pPr>
-      <w:bookmarkStart w:id="16" w:name="_Toc242732593"/>
-      <w:r>
-        <w:t>5.</w:t>
-      </w:r>
-      <w:r>
-        <w:t>3 Connection Risk Assessment</w:t>
-      </w:r>
-      <w:bookmarkEnd w:id="16"/>
-      <w:r>
-        <w:rPr>
-          <w:b/>
-          <w:bCs/>
-        </w:rPr>
-        <w:br/>
-      </w:r>
-    </w:p>
-    <w:p>
-      <w:r>
-        <w:t>Potential connecting flights will then be identified using scheduled flight information. Flights arriving and departing from the same airport within an appropriate connection window will be considered as potential connections. For each potential connection, the scheduled connection time will be calculated and compared with the predicted arrival delay to assess how much of the available connection time could be lost.</w:t>
-      </w:r>
-    </w:p>
-    <w:p>
-      <w:r>
-        <w:t>Where reliable Minimum Connection Time (MCT) information is available, this may also be considered when assessing the remaining connection buffer (International Air Transport Association, n.d.)</w:t>
-      </w:r>
-      <w:r>
-        <w:t>.</w:t>
-      </w:r>
-    </w:p>
-    <w:p>
-      <w:r>
-        <w:lastRenderedPageBreak/>
-        <w:t>This approach will allow potential connection risk to be analysed without assuming that the flights represent an actual passenger itinerary.</w:t>
+      <w:bookmarkStart w:id="17" w:name="_Toc242948931"/>
+      <w:r>
+        <w:t xml:space="preserve">5.4 </w:t>
+      </w:r>
+      <w:r>
+        <w:t>Technologies and Tools</w:t>
+      </w:r>
+      <w:bookmarkEnd w:id="17"/>
+    </w:p>
+    <w:p>
+      <w:r>
+        <w:t>Python will be used for data preparation, analysis, visualisation and modelling.</w:t>
+      </w:r>
+      <w:r>
+        <w:t xml:space="preserve"> Libraries such as Pandas and NumPy are expected to be used during the project.</w:t>
       </w:r>
     </w:p>
     <w:p/>
     <w:p/>
     <w:p>
       <w:pPr>
-        <w:pStyle w:val="Heading2"/>
-      </w:pPr>
-      <w:bookmarkStart w:id="17" w:name="_Toc242732594"/>
-      <w:r>
-        <w:t xml:space="preserve">5.4 </w:t>
-      </w:r>
-      <w:r>
-        <w:t>Technologies and Tools</w:t>
-      </w:r>
-      <w:bookmarkEnd w:id="17"/>
-    </w:p>
-    <w:p>
-      <w:r>
-        <w:t xml:space="preserve">Python will be used for data preparation, analysis, visualisation and modelling. Libraries such as Pandas, NumPy, </w:t>
-      </w:r>
-      <w:r>
-        <w:rPr>
-          <w:highlight w:val="yellow"/>
-        </w:rPr>
-        <w:t>Matplotlib and Scikit-learn are expecte</w:t>
-      </w:r>
-      <w:r>
-        <w:t>d to be used.</w:t>
-      </w:r>
-    </w:p>
-    <w:p/>
-    <w:p/>
-    <w:p>
-      <w:pPr>
         <w:pStyle w:val="Heading1"/>
+        <w:numPr>
+          <w:ilvl w:val="0"/>
+          <w:numId w:val="1"/>
+        </w:numPr>
         <w:tabs>
           <w:tab w:val="left" w:pos="2904"/>
         </w:tabs>
         <w:spacing w:before="0"/>
       </w:pPr>
-      <w:bookmarkStart w:id="18" w:name="_Toc242732595"/>
-      <w:r>
-        <w:t>6.</w:t>
-      </w:r>
-      <w:r>
-        <w:rPr>
-          <w:b/>
-          <w:bCs/>
-        </w:rPr>
-        <w:t xml:space="preserve"> </w:t>
-      </w:r>
+      <w:bookmarkStart w:id="18" w:name="_Toc242948932"/>
       <w:r>
         <w:t>High-Level Architecture</w:t>
       </w:r>
       <w:bookmarkEnd w:id="18"/>
+    </w:p>
+    <w:p>
+      <w:pPr>
+        <w:pStyle w:val="ListParagraph"/>
+      </w:pPr>
     </w:p>
     <w:p>
       <w:r>
@@ -3349,6 +3416,7 @@
         <w:t>The diagram shows how the raw airline data will be prepared, analysed and used to predict arrival delays. The predictions will then be used to assess potential flight connection risk and support business decision-making.</w:t>
       </w:r>
     </w:p>
+    <w:p/>
     <w:p>
       <w:pPr>
         <w:pStyle w:val="Heading1"/>
@@ -3361,8 +3429,9 @@
         </w:tabs>
         <w:spacing w:before="0"/>
       </w:pPr>
-      <w:bookmarkStart w:id="19" w:name="_Toc242732596"/>
-      <w:r>
+      <w:bookmarkStart w:id="19" w:name="_Toc242948933"/>
+      <w:r>
+        <w:lastRenderedPageBreak/>
         <w:t>Data Sources</w:t>
       </w:r>
       <w:bookmarkEnd w:id="19"/>
@@ -3379,7 +3448,6 @@
     </w:p>
     <w:p>
       <w:r>
-        <w:lastRenderedPageBreak/>
         <w:t>The dataset provides raw historical operational data on commercial flights, including flight dates, operating airlines, origin and destination airports, scheduled and actual departure and arrival times, delays, cancellations, diversions and flight distance (Bureau of Transportation Statistics, 2026a).</w:t>
       </w:r>
       <w:r>
@@ -3394,7 +3462,11 @@
         <w:t>The dataset is publicly available from BTS. The files, periods used, source and applicable data-use conditions will be documented in the final project. If Minimum Connection Time information is included, its source and conditions of use will also be documented.</w:t>
       </w:r>
     </w:p>
-    <w:p/>
+    <w:p>
+      <w:r>
+        <w:t>This dataset is suitable for the project because it contains both the delay information needed for the predictive analysis and the scheduled flight information needed to identify potential connections. It also includes operational variables such as airlines, airports, routes and distance, which can be explored to understand their relationship with arrival delays.</w:t>
+      </w:r>
+    </w:p>
     <w:p/>
     <w:p>
       <w:pPr>
@@ -3408,7 +3480,7 @@
         </w:tabs>
         <w:spacing w:before="0"/>
       </w:pPr>
-      <w:bookmarkStart w:id="20" w:name="_Toc242732597"/>
+      <w:bookmarkStart w:id="20" w:name="_Toc242948934"/>
       <w:r>
         <w:t>Expected Deliverables</w:t>
       </w:r>
@@ -3416,42 +3488,24 @@
     </w:p>
     <w:p>
       <w:r>
-        <w:t xml:space="preserve">The project is expected to produce a cleaned and prepared dataset from the original raw airline data, together with an </w:t>
-      </w:r>
-      <w:r>
-        <w:rPr>
-          <w:highlight w:val="yellow"/>
-        </w:rPr>
-        <w:t>exploratory analysis</w:t>
-      </w:r>
-      <w:r>
-        <w:t xml:space="preserve"> of flight delays and relevant visualisations.</w:t>
-      </w:r>
-    </w:p>
-    <w:p>
-      <w:r>
-        <w:rPr>
-          <w:highlight w:val="yellow"/>
-        </w:rPr>
-        <w:t>Predictive regression models</w:t>
-      </w:r>
-      <w:r>
-        <w:t xml:space="preserve"> will be developed and compared to estimate arrival delay duration. Their performance will be evaluated using appropriate regression metrics.</w:t>
-      </w:r>
-    </w:p>
-    <w:p>
-      <w:r>
-        <w:t>The predicted delays will then be applied to potential flight connections identified from scheduled flight information. This analysis will investigate whether delay predictions can help identify situations where the available connection time becomes limited and the potential risk of disruption increases.</w:t>
-      </w:r>
-    </w:p>
-    <w:p>
-      <w:r>
-        <w:t>The final results will be interpreted from a business perspective, including the possible value for airline operational and passenger-management decisions, as well as the limitations of the proposed approach.</w:t>
-      </w:r>
-    </w:p>
-    <w:p/>
-    <w:p/>
-    <w:p/>
+        <w:t>The project will produce a cleaned dataset from the original airline data and an analysis of flight delays with some visualisations.</w:t>
+      </w:r>
+    </w:p>
+    <w:p>
+      <w:r>
+        <w:t>Different regression models will be tested and compared to predict arrival delays. The models will also be evaluated using appropriate regression metrics.</w:t>
+      </w:r>
+    </w:p>
+    <w:p>
+      <w:r>
+        <w:t>The predicted delays will then be used to look at potential flight connections based on the scheduled flight information. This will help to see if a delay could reduce the time available for a connection and increase the risk of disruption.</w:t>
+      </w:r>
+    </w:p>
+    <w:p>
+      <w:r>
+        <w:t>Finally, I will look at how the results could be useful for airlines and passenger management. I will also consider the main limitations of the project.</w:t>
+      </w:r>
+    </w:p>
     <w:p/>
     <w:p/>
     <w:p>
@@ -3466,9 +3520,8 @@
         </w:tabs>
         <w:spacing w:before="0"/>
       </w:pPr>
-      <w:bookmarkStart w:id="21" w:name="_Toc242732598"/>
-      <w:r>
-        <w:lastRenderedPageBreak/>
+      <w:bookmarkStart w:id="21" w:name="_Toc242948935"/>
+      <w:r>
         <w:t>Project Timeline</w:t>
       </w:r>
       <w:bookmarkEnd w:id="21"/>
@@ -3480,547 +3533,9 @@
       <w:r>
         <w:t>ow:</w:t>
       </w:r>
-    </w:p>
-    <w:p/>
-    <w:tbl>
-      <w:tblPr>
-        <w:tblW w:w="0" w:type="auto"/>
-        <w:tblCellSpacing w:w="15" w:type="dxa"/>
-        <w:tblCellMar>
-          <w:top w:w="15" w:type="dxa"/>
-          <w:left w:w="15" w:type="dxa"/>
-          <w:bottom w:w="15" w:type="dxa"/>
-          <w:right w:w="15" w:type="dxa"/>
-        </w:tblCellMar>
-        <w:tblLook w:val="04A0" w:firstRow="1" w:lastRow="0" w:firstColumn="1" w:lastColumn="0" w:noHBand="0" w:noVBand="1"/>
-      </w:tblPr>
-      <w:tblGrid>
-        <w:gridCol w:w="2946"/>
-        <w:gridCol w:w="1291"/>
-        <w:gridCol w:w="1988"/>
-      </w:tblGrid>
-      <w:tr>
-        <w:trPr>
-          <w:tblHeader/>
-          <w:tblCellSpacing w:w="15" w:type="dxa"/>
-        </w:trPr>
-        <w:tc>
-          <w:tcPr>
-            <w:tcW w:w="0" w:type="auto"/>
-            <w:vAlign w:val="center"/>
-            <w:hideMark/>
-          </w:tcPr>
-          <w:p>
-            <w:pPr>
-              <w:rPr>
-                <w:b/>
-                <w:bCs/>
-              </w:rPr>
-            </w:pPr>
-            <w:r>
-              <w:rPr>
-                <w:b/>
-                <w:bCs/>
-              </w:rPr>
-              <w:t>Activity</w:t>
-            </w:r>
-          </w:p>
-        </w:tc>
-        <w:tc>
-          <w:tcPr>
-            <w:tcW w:w="0" w:type="auto"/>
-            <w:vAlign w:val="center"/>
-            <w:hideMark/>
-          </w:tcPr>
-          <w:p>
-            <w:pPr>
-              <w:rPr>
-                <w:b/>
-                <w:bCs/>
-              </w:rPr>
-            </w:pPr>
-            <w:r>
-              <w:rPr>
-                <w:b/>
-                <w:bCs/>
-              </w:rPr>
-              <w:t>Semester 1</w:t>
-            </w:r>
-          </w:p>
-        </w:tc>
-        <w:tc>
-          <w:tcPr>
-            <w:tcW w:w="0" w:type="auto"/>
-            <w:vAlign w:val="center"/>
-            <w:hideMark/>
-          </w:tcPr>
-          <w:p>
-            <w:pPr>
-              <w:rPr>
-                <w:b/>
-                <w:bCs/>
-              </w:rPr>
-            </w:pPr>
-            <w:r>
-              <w:rPr>
-                <w:b/>
-                <w:bCs/>
-              </w:rPr>
-              <w:t xml:space="preserve">              </w:t>
-            </w:r>
-            <w:r>
-              <w:rPr>
-                <w:b/>
-                <w:bCs/>
-              </w:rPr>
-              <w:t>Semester 2</w:t>
-            </w:r>
-          </w:p>
-        </w:tc>
-      </w:tr>
-      <w:tr>
-        <w:trPr>
-          <w:tblCellSpacing w:w="15" w:type="dxa"/>
-        </w:trPr>
-        <w:tc>
-          <w:tcPr>
-            <w:tcW w:w="0" w:type="auto"/>
-            <w:vAlign w:val="center"/>
-            <w:hideMark/>
-          </w:tcPr>
-          <w:p>
-            <w:r>
-              <w:t>Define business problem</w:t>
-            </w:r>
-          </w:p>
-        </w:tc>
-        <w:tc>
-          <w:tcPr>
-            <w:tcW w:w="0" w:type="auto"/>
-            <w:vAlign w:val="center"/>
-            <w:hideMark/>
-          </w:tcPr>
-          <w:p>
-            <w:r>
-              <w:t xml:space="preserve">       </w:t>
-            </w:r>
-            <w:r>
-              <w:t>✓</w:t>
-            </w:r>
-          </w:p>
-        </w:tc>
-        <w:tc>
-          <w:tcPr>
-            <w:tcW w:w="0" w:type="auto"/>
-            <w:vAlign w:val="center"/>
-            <w:hideMark/>
-          </w:tcPr>
-          <w:p/>
-        </w:tc>
-      </w:tr>
-      <w:tr>
-        <w:trPr>
-          <w:tblCellSpacing w:w="15" w:type="dxa"/>
-        </w:trPr>
-        <w:tc>
-          <w:tcPr>
-            <w:tcW w:w="0" w:type="auto"/>
-            <w:vAlign w:val="center"/>
-            <w:hideMark/>
-          </w:tcPr>
-          <w:p>
-            <w:r>
-              <w:t>Literature review</w:t>
-            </w:r>
-          </w:p>
-        </w:tc>
-        <w:tc>
-          <w:tcPr>
-            <w:tcW w:w="0" w:type="auto"/>
-            <w:vAlign w:val="center"/>
-            <w:hideMark/>
-          </w:tcPr>
-          <w:p>
-            <w:r>
-              <w:t xml:space="preserve">       </w:t>
-            </w:r>
-            <w:r>
-              <w:t>✓</w:t>
-            </w:r>
-          </w:p>
-        </w:tc>
-        <w:tc>
-          <w:tcPr>
-            <w:tcW w:w="0" w:type="auto"/>
-            <w:vAlign w:val="center"/>
-            <w:hideMark/>
-          </w:tcPr>
-          <w:p/>
-        </w:tc>
-      </w:tr>
-      <w:tr>
-        <w:trPr>
-          <w:tblCellSpacing w:w="15" w:type="dxa"/>
-        </w:trPr>
-        <w:tc>
-          <w:tcPr>
-            <w:tcW w:w="0" w:type="auto"/>
-            <w:vAlign w:val="center"/>
-            <w:hideMark/>
-          </w:tcPr>
-          <w:p>
-            <w:r>
-              <w:t>Data collection</w:t>
-            </w:r>
-          </w:p>
-        </w:tc>
-        <w:tc>
-          <w:tcPr>
-            <w:tcW w:w="0" w:type="auto"/>
-            <w:vAlign w:val="center"/>
-            <w:hideMark/>
-          </w:tcPr>
-          <w:p>
-            <w:r>
-              <w:t xml:space="preserve">       </w:t>
-            </w:r>
-            <w:r>
-              <w:t>✓</w:t>
-            </w:r>
-          </w:p>
-        </w:tc>
-        <w:tc>
-          <w:tcPr>
-            <w:tcW w:w="0" w:type="auto"/>
-            <w:vAlign w:val="center"/>
-            <w:hideMark/>
-          </w:tcPr>
-          <w:p/>
-        </w:tc>
-      </w:tr>
-      <w:tr>
-        <w:trPr>
-          <w:tblCellSpacing w:w="15" w:type="dxa"/>
-        </w:trPr>
-        <w:tc>
-          <w:tcPr>
-            <w:tcW w:w="0" w:type="auto"/>
-            <w:vAlign w:val="center"/>
-            <w:hideMark/>
-          </w:tcPr>
-          <w:p>
-            <w:r>
-              <w:t>Data cleaning &amp; preparation</w:t>
-            </w:r>
-          </w:p>
-        </w:tc>
-        <w:tc>
-          <w:tcPr>
-            <w:tcW w:w="0" w:type="auto"/>
-            <w:vAlign w:val="center"/>
-            <w:hideMark/>
-          </w:tcPr>
-          <w:p>
-            <w:r>
-              <w:t xml:space="preserve">       </w:t>
-            </w:r>
-            <w:r>
-              <w:t>✓</w:t>
-            </w:r>
-          </w:p>
-        </w:tc>
-        <w:tc>
-          <w:tcPr>
-            <w:tcW w:w="0" w:type="auto"/>
-            <w:vAlign w:val="center"/>
-            <w:hideMark/>
-          </w:tcPr>
-          <w:p/>
-        </w:tc>
-      </w:tr>
-      <w:tr>
-        <w:trPr>
-          <w:tblCellSpacing w:w="15" w:type="dxa"/>
-        </w:trPr>
-        <w:tc>
-          <w:tcPr>
-            <w:tcW w:w="0" w:type="auto"/>
-            <w:vAlign w:val="center"/>
-            <w:hideMark/>
-          </w:tcPr>
-          <w:p>
-            <w:r>
-              <w:t>Exploratory Data Analysis</w:t>
-            </w:r>
-          </w:p>
-        </w:tc>
-        <w:tc>
-          <w:tcPr>
-            <w:tcW w:w="0" w:type="auto"/>
-            <w:vAlign w:val="center"/>
-            <w:hideMark/>
-          </w:tcPr>
-          <w:p>
-            <w:r>
-              <w:t xml:space="preserve">       </w:t>
-            </w:r>
-            <w:r>
-              <w:t>✓</w:t>
-            </w:r>
-          </w:p>
-        </w:tc>
-        <w:tc>
-          <w:tcPr>
-            <w:tcW w:w="0" w:type="auto"/>
-            <w:vAlign w:val="center"/>
-            <w:hideMark/>
-          </w:tcPr>
-          <w:p/>
-        </w:tc>
-      </w:tr>
-      <w:tr>
-        <w:trPr>
-          <w:tblCellSpacing w:w="15" w:type="dxa"/>
-        </w:trPr>
-        <w:tc>
-          <w:tcPr>
-            <w:tcW w:w="0" w:type="auto"/>
-            <w:vAlign w:val="center"/>
-            <w:hideMark/>
-          </w:tcPr>
-          <w:p>
-            <w:r>
-              <w:t>Feature engineering</w:t>
-            </w:r>
-          </w:p>
-        </w:tc>
-        <w:tc>
-          <w:tcPr>
-            <w:tcW w:w="0" w:type="auto"/>
-            <w:vAlign w:val="center"/>
-            <w:hideMark/>
-          </w:tcPr>
-          <w:p>
-            <w:r>
-              <w:t xml:space="preserve">       </w:t>
-            </w:r>
-            <w:r>
-              <w:t>✓</w:t>
-            </w:r>
-          </w:p>
-        </w:tc>
-        <w:tc>
-          <w:tcPr>
-            <w:tcW w:w="0" w:type="auto"/>
-            <w:vAlign w:val="center"/>
-            <w:hideMark/>
-          </w:tcPr>
-          <w:p/>
-        </w:tc>
-      </w:tr>
-      <w:tr>
-        <w:trPr>
-          <w:tblCellSpacing w:w="15" w:type="dxa"/>
-        </w:trPr>
-        <w:tc>
-          <w:tcPr>
-            <w:tcW w:w="0" w:type="auto"/>
-            <w:vAlign w:val="center"/>
-            <w:hideMark/>
-          </w:tcPr>
-          <w:p>
-            <w:r>
-              <w:t>Regression modelling</w:t>
-            </w:r>
-          </w:p>
-        </w:tc>
-        <w:tc>
-          <w:tcPr>
-            <w:tcW w:w="0" w:type="auto"/>
-            <w:vAlign w:val="center"/>
-            <w:hideMark/>
-          </w:tcPr>
-          <w:p/>
-        </w:tc>
-        <w:tc>
-          <w:tcPr>
-            <w:tcW w:w="0" w:type="auto"/>
-            <w:vAlign w:val="center"/>
-            <w:hideMark/>
-          </w:tcPr>
-          <w:p>
-            <w:r>
-              <w:t xml:space="preserve">                   </w:t>
-            </w:r>
-            <w:r>
-              <w:t>✓</w:t>
-            </w:r>
-          </w:p>
-        </w:tc>
-      </w:tr>
-      <w:tr>
-        <w:trPr>
-          <w:tblCellSpacing w:w="15" w:type="dxa"/>
-        </w:trPr>
-        <w:tc>
-          <w:tcPr>
-            <w:tcW w:w="0" w:type="auto"/>
-            <w:vAlign w:val="center"/>
-            <w:hideMark/>
-          </w:tcPr>
-          <w:p>
-            <w:r>
-              <w:t>Model evaluation</w:t>
-            </w:r>
-          </w:p>
-        </w:tc>
-        <w:tc>
-          <w:tcPr>
-            <w:tcW w:w="0" w:type="auto"/>
-            <w:vAlign w:val="center"/>
-            <w:hideMark/>
-          </w:tcPr>
-          <w:p/>
-        </w:tc>
-        <w:tc>
-          <w:tcPr>
-            <w:tcW w:w="0" w:type="auto"/>
-            <w:vAlign w:val="center"/>
-            <w:hideMark/>
-          </w:tcPr>
-          <w:p>
-            <w:r>
-              <w:t xml:space="preserve">                   </w:t>
-            </w:r>
-            <w:r>
-              <w:t>✓</w:t>
-            </w:r>
-          </w:p>
-        </w:tc>
-      </w:tr>
-      <w:tr>
-        <w:trPr>
-          <w:tblCellSpacing w:w="15" w:type="dxa"/>
-        </w:trPr>
-        <w:tc>
-          <w:tcPr>
-            <w:tcW w:w="0" w:type="auto"/>
-            <w:vAlign w:val="center"/>
-            <w:hideMark/>
-          </w:tcPr>
-          <w:p>
-            <w:r>
-              <w:t>Connection risk analysis</w:t>
-            </w:r>
-          </w:p>
-        </w:tc>
-        <w:tc>
-          <w:tcPr>
-            <w:tcW w:w="0" w:type="auto"/>
-            <w:vAlign w:val="center"/>
-            <w:hideMark/>
-          </w:tcPr>
-          <w:p/>
-        </w:tc>
-        <w:tc>
-          <w:tcPr>
-            <w:tcW w:w="0" w:type="auto"/>
-            <w:vAlign w:val="center"/>
-            <w:hideMark/>
-          </w:tcPr>
-          <w:p>
-            <w:r>
-              <w:t xml:space="preserve">                   </w:t>
-            </w:r>
-            <w:r>
-              <w:t>✓</w:t>
-            </w:r>
-          </w:p>
-        </w:tc>
-      </w:tr>
-      <w:tr>
-        <w:trPr>
-          <w:tblCellSpacing w:w="15" w:type="dxa"/>
-        </w:trPr>
-        <w:tc>
-          <w:tcPr>
-            <w:tcW w:w="0" w:type="auto"/>
-            <w:vAlign w:val="center"/>
-            <w:hideMark/>
-          </w:tcPr>
-          <w:p>
-            <w:r>
-              <w:t>Business interpretation</w:t>
-            </w:r>
-          </w:p>
-        </w:tc>
-        <w:tc>
-          <w:tcPr>
-            <w:tcW w:w="0" w:type="auto"/>
-            <w:vAlign w:val="center"/>
-            <w:hideMark/>
-          </w:tcPr>
-          <w:p/>
-        </w:tc>
-        <w:tc>
-          <w:tcPr>
-            <w:tcW w:w="0" w:type="auto"/>
-            <w:vAlign w:val="center"/>
-            <w:hideMark/>
-          </w:tcPr>
-          <w:p>
-            <w:r>
-              <w:t xml:space="preserve">                   </w:t>
-            </w:r>
-            <w:r>
-              <w:t>✓</w:t>
-            </w:r>
-          </w:p>
-        </w:tc>
-      </w:tr>
-      <w:tr>
-        <w:trPr>
-          <w:tblCellSpacing w:w="15" w:type="dxa"/>
-        </w:trPr>
-        <w:tc>
-          <w:tcPr>
-            <w:tcW w:w="0" w:type="auto"/>
-            <w:vAlign w:val="center"/>
-            <w:hideMark/>
-          </w:tcPr>
-          <w:p>
-            <w:r>
-              <w:t>Final report</w:t>
-            </w:r>
-          </w:p>
-        </w:tc>
-        <w:tc>
-          <w:tcPr>
-            <w:tcW w:w="0" w:type="auto"/>
-            <w:vAlign w:val="center"/>
-            <w:hideMark/>
-          </w:tcPr>
-          <w:p/>
-        </w:tc>
-        <w:tc>
-          <w:tcPr>
-            <w:tcW w:w="0" w:type="auto"/>
-            <w:vAlign w:val="center"/>
-            <w:hideMark/>
-          </w:tcPr>
-          <w:p>
-            <w:r>
-              <w:t xml:space="preserve">                   </w:t>
-            </w:r>
-            <w:r>
-              <w:t>✓</w:t>
-            </w:r>
-          </w:p>
-        </w:tc>
-      </w:tr>
-    </w:tbl>
-    <w:p/>
-    <w:p>
+      <w:r>
+        <w:t xml:space="preserve"> </w:t>
+      </w:r>
       <w:r>
         <w:t>Project Timeline – Gantt Chart</w:t>
       </w:r>
@@ -4031,10 +3546,10 @@
           <w:noProof/>
         </w:rPr>
         <w:drawing>
-          <wp:inline distT="0" distB="0" distL="0" distR="0" wp14:anchorId="57D7514C" wp14:editId="4CE6955C">
-            <wp:extent cx="5731510" cy="2498725"/>
-            <wp:effectExtent l="0" t="0" r="2540" b="0"/>
-            <wp:docPr id="322083927" name="Picture 1"/>
+          <wp:inline distT="0" distB="0" distL="0" distR="0" wp14:anchorId="72FCDE05" wp14:editId="69DE6AD0">
+            <wp:extent cx="4892464" cy="4572396"/>
+            <wp:effectExtent l="0" t="0" r="3810" b="0"/>
+            <wp:docPr id="371861512" name="Picture 1"/>
             <wp:cNvGraphicFramePr>
               <a:graphicFrameLocks xmlns:a="http://schemas.openxmlformats.org/drawingml/2006/main" noChangeAspect="1"/>
             </wp:cNvGraphicFramePr>
@@ -4042,7 +3557,7 @@
               <a:graphicData uri="http://schemas.openxmlformats.org/drawingml/2006/picture">
                 <pic:pic xmlns:pic="http://schemas.openxmlformats.org/drawingml/2006/picture">
                   <pic:nvPicPr>
-                    <pic:cNvPr id="322083927" name=""/>
+                    <pic:cNvPr id="371861512" name=""/>
                     <pic:cNvPicPr/>
                   </pic:nvPicPr>
                   <pic:blipFill>
@@ -4054,7 +3569,7 @@
                   <pic:spPr>
                     <a:xfrm>
                       <a:off x="0" y="0"/>
-                      <a:ext cx="5731510" cy="2498725"/>
+                      <a:ext cx="4892464" cy="4572396"/>
                     </a:xfrm>
                     <a:prstGeom prst="rect">
                       <a:avLst/>
@@ -4067,23 +3582,29 @@
         </w:drawing>
       </w:r>
     </w:p>
+    <w:p>
+      <w:r>
+        <w:t>The project will be developed across two semesters.</w:t>
+      </w:r>
+    </w:p>
+    <w:p>
+      <w:r>
+        <w:t>During the first semester, the main activities will include defining the business problem, reviewing relevant literature, collecting the raw data, cleaning and preparing the dataset, conducting Exploratory Data Analysis</w:t>
+      </w:r>
+      <w:r>
+        <w:t>.</w:t>
+      </w:r>
+    </w:p>
+    <w:p>
+      <w:r>
+        <w:t>During the second semester, different regression models will be developed, evaluated and compared. The selected approach will then be applied to the potential flight connection risk analysis. The final stages will include business interpretation, discussion of limitations, recommendations and completion of the Capstone report.</w:t>
+      </w:r>
+    </w:p>
     <w:p/>
     <w:p/>
-    <w:p>
-      <w:r>
-        <w:t>The project will be developed across two semesters.</w:t>
-      </w:r>
-    </w:p>
-    <w:p>
-      <w:r>
-        <w:t>During the first semester, the main activities will include defining the business problem, reviewing relevant literature, collecting the raw data, cleaning and preparing the dataset, conducting Exploratory Data Analysis and beginning feature selection and engineering.</w:t>
-      </w:r>
-    </w:p>
-    <w:p>
-      <w:r>
-        <w:t>During the second semester, different regression models will be developed, evaluated and compared. The selected approach will then be applied to the potential flight connection risk analysis. The final stages will include business interpretation, discussion of limitations, recommendations and completion of the Capstone report.</w:t>
-      </w:r>
-    </w:p>
+    <w:p/>
+    <w:p/>
+    <w:p/>
     <w:p>
       <w:pPr>
         <w:pStyle w:val="Heading1"/>
@@ -4092,7 +3613,7 @@
         </w:tabs>
         <w:spacing w:before="0"/>
       </w:pPr>
-      <w:bookmarkStart w:id="22" w:name="_Toc242732599"/>
+      <w:bookmarkStart w:id="22" w:name="_Toc242948936"/>
       <w:r>
         <w:t>10.</w:t>
       </w:r>
@@ -4120,7 +3641,15 @@
     </w:p>
     <w:p>
       <w:r>
-        <w:t>The interpretation of the predictive results will also be considered carefully. Model predictions are estimates and should not be treated as certain outcomes. A potential connection identified as being at risk will not mean that a passenger will definitely miss the next flight.</w:t>
+        <w:t xml:space="preserve">The interpretation of the predictive results will also be considered carefully. Model predictions are estimates and should not be treated as certain outcomes. A potential connection identified as being at risk will not mean that a passenger will </w:t>
+      </w:r>
+      <w:proofErr w:type="gramStart"/>
+      <w:r>
+        <w:t>definitely miss</w:t>
+      </w:r>
+      <w:proofErr w:type="gramEnd"/>
+      <w:r>
+        <w:t xml:space="preserve"> the next flight.</w:t>
       </w:r>
     </w:p>
     <w:p/>
@@ -4130,14 +3659,13 @@
         <w:pStyle w:val="Heading1"/>
       </w:pPr>
       <w:bookmarkStart w:id="23" w:name="_Toc242717971"/>
-      <w:bookmarkStart w:id="24" w:name="_Toc242732600"/>
+      <w:bookmarkStart w:id="24" w:name="_Toc242948937"/>
       <w:r>
         <w:t>References</w:t>
       </w:r>
       <w:bookmarkEnd w:id="23"/>
       <w:bookmarkEnd w:id="24"/>
     </w:p>
-    <w:p/>
     <w:p>
       <w:r>
         <w:t xml:space="preserve">Bureau of Transportation Statistics (2026) </w:t>
@@ -4167,8 +3695,15 @@
     <w:p/>
     <w:p>
       <w:r>
-        <w:lastRenderedPageBreak/>
-        <w:t xml:space="preserve">Guimarães, M., Soares, C. and Ventura, R. (2022) ‘Decision Support Models for Predicting and Explaining Airport Passenger Connectivity From Data’, </w:t>
+        <w:t xml:space="preserve">Guimarães, M., Soares, C. and Ventura, R. (2022) ‘Decision Support Models for Predicting and Explaining Airport Passenger Connectivity </w:t>
+      </w:r>
+      <w:proofErr w:type="gramStart"/>
+      <w:r>
+        <w:t>From</w:t>
+      </w:r>
+      <w:proofErr w:type="gramEnd"/>
+      <w:r>
+        <w:t xml:space="preserve"> Data’, </w:t>
       </w:r>
       <w:r>
         <w:rPr>
@@ -4235,7 +3770,7 @@
       </w:pPr>
       <w:bookmarkStart w:id="25" w:name="_heading=h.kfkjs3rwl2c1" w:colFirst="0" w:colLast="0"/>
       <w:bookmarkStart w:id="26" w:name="_Toc242717972"/>
-      <w:bookmarkStart w:id="27" w:name="_Toc242732601"/>
+      <w:bookmarkStart w:id="27" w:name="_Toc242948938"/>
       <w:bookmarkEnd w:id="25"/>
       <w:r>
         <w:t>Appendix</w:t>
@@ -4291,7 +3826,6 @@
           <w:noProof/>
           <w:color w:val="FF0000"/>
         </w:rPr>
-        <w:lastRenderedPageBreak/>
         <w:drawing>
           <wp:inline distT="0" distB="0" distL="0" distR="0" wp14:anchorId="6B5DEC65" wp14:editId="3B9BAEE9">
             <wp:extent cx="4960620" cy="4905111"/>
@@ -4420,7 +3954,6 @@
         <w:rPr>
           <w:noProof/>
         </w:rPr>
-        <w:lastRenderedPageBreak/>
         <w:drawing>
           <wp:inline distT="0" distB="0" distL="0" distR="0" wp14:anchorId="3FFB44F7" wp14:editId="25917BFE">
             <wp:extent cx="4435224" cy="5349704"/>
@@ -4793,7 +4326,7 @@
       <w:lvlText w:val="%1."/>
       <w:lvlJc w:val="left"/>
       <w:pPr>
-        <w:ind w:left="720" w:hanging="360"/>
+        <w:ind w:left="786" w:hanging="360"/>
       </w:pPr>
       <w:rPr>
         <w:rFonts w:hint="default"/>
@@ -4805,7 +4338,7 @@
       <w:lvlText w:val="%2."/>
       <w:lvlJc w:val="left"/>
       <w:pPr>
-        <w:ind w:left="1440" w:hanging="360"/>
+        <w:ind w:left="1506" w:hanging="360"/>
       </w:pPr>
     </w:lvl>
     <w:lvl w:ilvl="2" w:tplc="1809001B" w:tentative="1">
@@ -4814,7 +4347,7 @@
       <w:lvlText w:val="%3."/>
       <w:lvlJc w:val="right"/>
       <w:pPr>
-        <w:ind w:left="2160" w:hanging="180"/>
+        <w:ind w:left="2226" w:hanging="180"/>
       </w:pPr>
     </w:lvl>
     <w:lvl w:ilvl="3" w:tplc="1809000F" w:tentative="1">
@@ -4823,7 +4356,7 @@
       <w:lvlText w:val="%4."/>
       <w:lvlJc w:val="left"/>
       <w:pPr>
-        <w:ind w:left="2880" w:hanging="360"/>
+        <w:ind w:left="2946" w:hanging="360"/>
       </w:pPr>
     </w:lvl>
     <w:lvl w:ilvl="4" w:tplc="18090019" w:tentative="1">
@@ -4832,7 +4365,7 @@
       <w:lvlText w:val="%5."/>
       <w:lvlJc w:val="left"/>
       <w:pPr>
-        <w:ind w:left="3600" w:hanging="360"/>
+        <w:ind w:left="3666" w:hanging="360"/>
       </w:pPr>
     </w:lvl>
     <w:lvl w:ilvl="5" w:tplc="1809001B" w:tentative="1">
@@ -4841,7 +4374,7 @@
       <w:lvlText w:val="%6."/>
       <w:lvlJc w:val="right"/>
       <w:pPr>
-        <w:ind w:left="4320" w:hanging="180"/>
+        <w:ind w:left="4386" w:hanging="180"/>
       </w:pPr>
     </w:lvl>
     <w:lvl w:ilvl="6" w:tplc="1809000F" w:tentative="1">
@@ -4850,7 +4383,7 @@
       <w:lvlText w:val="%7."/>
       <w:lvlJc w:val="left"/>
       <w:pPr>
-        <w:ind w:left="5040" w:hanging="360"/>
+        <w:ind w:left="5106" w:hanging="360"/>
       </w:pPr>
     </w:lvl>
     <w:lvl w:ilvl="7" w:tplc="18090019" w:tentative="1">
@@ -4859,7 +4392,7 @@
       <w:lvlText w:val="%8."/>
       <w:lvlJc w:val="left"/>
       <w:pPr>
-        <w:ind w:left="5760" w:hanging="360"/>
+        <w:ind w:left="5826" w:hanging="360"/>
       </w:pPr>
     </w:lvl>
     <w:lvl w:ilvl="8" w:tplc="1809001B" w:tentative="1">
@@ -4868,7 +4401,7 @@
       <w:lvlText w:val="%9."/>
       <w:lvlJc w:val="right"/>
       <w:pPr>
-        <w:ind w:left="6480" w:hanging="180"/>
+        <w:ind w:left="6546" w:hanging="180"/>
       </w:pPr>
     </w:lvl>
   </w:abstractNum>

</xml_diff>